<commit_message>
feat(ah-pdf): Konditionen auf neuer Seite + PDF-Vorschau-Skript
- AH-Angebot.docx: Seitenumbruch vor dem Konditionen-Teil statt Leerzeilen
  als Abstandshalter. Bei HnD + Alltagsbegleitung entsteht dadurch keine
  große Lücke mehr; beide Konditionen-Blöcke starten gemeinsam auf Seite 2.
- buildAhData: AhHasEigenanteil und AhEigenanteil leiten sich aus einem
  gemeinsamen hasEigenanteil ab (vorher konnte AhEigenanteil "0,00 €"
  liefern, während die Zeile ausgeblendet war). AhHasKonditionen wieder
  entfernt – der Seitenumbruch steckt im Template.
- scripts/preview-pdf.mjs + scenarios/pdf/*.json: Angebots-PDFs lokal aus
  Fixtures rendern (npm run preview:pdf), ohne Server/Login/Browser, über
  denselben Pfad wie die App. Doku in docs/preview-pdfs.md.

Co-Authored-By: Claude <noreply@anthropic.com>
</commit_message>
<xml_diff>
--- a/src/templates/AH-Angebot.docx
+++ b/src/templates/AH-Angebot.docx
@@ -121,8 +121,8 @@
       </w:tblPr>
       <w:tblGrid>
         <w:gridCol w:w="5686"/>
-        <w:gridCol w:w="1705"/>
-        <w:gridCol w:w="2524"/>
+        <w:gridCol w:w="1704"/>
+        <w:gridCol w:w="2525"/>
       </w:tblGrid>
       <w:tr>
         <w:trPr>
@@ -344,7 +344,7 @@
         </w:tc>
         <w:tc>
           <w:tcPr>
-            <w:tcW w:w="1705" w:type="dxa"/>
+            <w:tcW w:w="1704" w:type="dxa"/>
             <w:tcBorders/>
             <w:shd w:color="auto" w:fill="auto" w:val="clear"/>
           </w:tcPr>
@@ -534,7 +534,7 @@
         </w:tc>
         <w:tc>
           <w:tcPr>
-            <w:tcW w:w="2524" w:type="dxa"/>
+            <w:tcW w:w="2525" w:type="dxa"/>
             <w:tcBorders/>
             <w:shd w:color="auto" w:fill="auto" w:val="clear"/>
           </w:tcPr>
@@ -2102,265 +2102,30 @@
         </w:rPr>
         <w:t>{AhNote}</w:t>
       </w:r>
-    </w:p>
-    <w:p>
-      <w:pPr>
-        <w:pStyle w:val="Normal"/>
-        <w:widowControl w:val="false"/>
-        <w:tabs>
-          <w:tab w:val="clear" w:pos="709"/>
-          <w:tab w:val="left" w:pos="2827" w:leader="none"/>
-        </w:tabs>
-        <w:spacing w:before="171" w:after="171"/>
-        <w:rPr>
-          <w:rFonts w:ascii="Helvetica Neue" w:hAnsi="Helvetica Neue"/>
-          <w:b/>
-          <w:bCs/>
-          <w:sz w:val="18"/>
-          <w:szCs w:val="18"/>
-          <w:lang w:val="de-DE" w:eastAsia="ru-RU"/>
-        </w:rPr>
-      </w:pPr>
       <w:r>
-        <w:rPr>
-          <w:rFonts w:ascii="Helvetica Neue" w:hAnsi="Helvetica Neue"/>
-          <w:b/>
-          <w:bCs/>
-          <w:sz w:val="18"/>
-          <w:szCs w:val="18"/>
-          <w:lang w:val="de-DE" w:eastAsia="ru-RU"/>
-        </w:rPr>
+        <w:br w:type="page"/>
       </w:r>
     </w:p>
     <w:p>
       <w:pPr>
         <w:pStyle w:val="Normal"/>
-        <w:widowControl w:val="false"/>
-        <w:tabs>
-          <w:tab w:val="clear" w:pos="709"/>
-          <w:tab w:val="left" w:pos="2827" w:leader="none"/>
-        </w:tabs>
-        <w:spacing w:before="171" w:after="171"/>
+        <w:spacing w:before="0" w:after="40"/>
         <w:rPr>
-          <w:rFonts w:ascii="Helvetica Neue" w:hAnsi="Helvetica Neue"/>
-          <w:b/>
-          <w:bCs/>
+          <w:rFonts w:ascii="Helvetica Neue" w:hAnsi="Helvetica Neue" w:eastAsia="Open Sans" w:cs="Open Sans"/>
+          <w:i/>
+          <w:i/>
+          <w:color w:val="444444"/>
           <w:sz w:val="18"/>
           <w:szCs w:val="18"/>
-          <w:lang w:val="de-DE" w:eastAsia="ru-RU"/>
         </w:rPr>
       </w:pPr>
       <w:r>
         <w:rPr>
-          <w:rFonts w:ascii="Helvetica Neue" w:hAnsi="Helvetica Neue"/>
-          <w:b/>
-          <w:bCs/>
+          <w:rFonts w:eastAsia="Open Sans" w:cs="Open Sans" w:ascii="Helvetica Neue" w:hAnsi="Helvetica Neue"/>
+          <w:i/>
+          <w:color w:val="444444"/>
           <w:sz w:val="18"/>
           <w:szCs w:val="18"/>
-          <w:lang w:val="de-DE" w:eastAsia="ru-RU"/>
-        </w:rPr>
-      </w:r>
-    </w:p>
-    <w:p>
-      <w:pPr>
-        <w:pStyle w:val="Normal"/>
-        <w:widowControl w:val="false"/>
-        <w:tabs>
-          <w:tab w:val="clear" w:pos="709"/>
-          <w:tab w:val="left" w:pos="2827" w:leader="none"/>
-        </w:tabs>
-        <w:spacing w:before="171" w:after="171"/>
-        <w:rPr>
-          <w:rFonts w:ascii="Helvetica Neue" w:hAnsi="Helvetica Neue"/>
-          <w:b/>
-          <w:bCs/>
-          <w:sz w:val="18"/>
-          <w:szCs w:val="18"/>
-          <w:lang w:val="de-DE" w:eastAsia="ru-RU"/>
-        </w:rPr>
-      </w:pPr>
-      <w:r>
-        <w:rPr>
-          <w:rFonts w:ascii="Helvetica Neue" w:hAnsi="Helvetica Neue"/>
-          <w:b/>
-          <w:bCs/>
-          <w:sz w:val="18"/>
-          <w:szCs w:val="18"/>
-          <w:lang w:val="de-DE" w:eastAsia="ru-RU"/>
-        </w:rPr>
-      </w:r>
-    </w:p>
-    <w:p>
-      <w:pPr>
-        <w:pStyle w:val="Normal"/>
-        <w:widowControl w:val="false"/>
-        <w:tabs>
-          <w:tab w:val="clear" w:pos="709"/>
-          <w:tab w:val="left" w:pos="2827" w:leader="none"/>
-        </w:tabs>
-        <w:spacing w:before="171" w:after="171"/>
-        <w:rPr>
-          <w:rFonts w:ascii="Helvetica Neue" w:hAnsi="Helvetica Neue"/>
-          <w:b/>
-          <w:bCs/>
-          <w:sz w:val="18"/>
-          <w:szCs w:val="18"/>
-          <w:lang w:val="de-DE" w:eastAsia="ru-RU"/>
-        </w:rPr>
-      </w:pPr>
-      <w:r>
-        <w:rPr>
-          <w:rFonts w:ascii="Helvetica Neue" w:hAnsi="Helvetica Neue"/>
-          <w:b/>
-          <w:bCs/>
-          <w:sz w:val="18"/>
-          <w:szCs w:val="18"/>
-          <w:lang w:val="de-DE" w:eastAsia="ru-RU"/>
-        </w:rPr>
-      </w:r>
-    </w:p>
-    <w:p>
-      <w:pPr>
-        <w:pStyle w:val="Normal"/>
-        <w:widowControl w:val="false"/>
-        <w:tabs>
-          <w:tab w:val="clear" w:pos="709"/>
-          <w:tab w:val="left" w:pos="2827" w:leader="none"/>
-        </w:tabs>
-        <w:spacing w:before="171" w:after="171"/>
-        <w:rPr>
-          <w:rFonts w:ascii="Helvetica Neue" w:hAnsi="Helvetica Neue"/>
-          <w:b/>
-          <w:bCs/>
-          <w:sz w:val="18"/>
-          <w:szCs w:val="18"/>
-          <w:lang w:val="de-DE" w:eastAsia="ru-RU"/>
-        </w:rPr>
-      </w:pPr>
-      <w:r>
-        <w:rPr>
-          <w:rFonts w:ascii="Helvetica Neue" w:hAnsi="Helvetica Neue"/>
-          <w:b/>
-          <w:bCs/>
-          <w:sz w:val="18"/>
-          <w:szCs w:val="18"/>
-          <w:lang w:val="de-DE" w:eastAsia="ru-RU"/>
-        </w:rPr>
-      </w:r>
-    </w:p>
-    <w:p>
-      <w:pPr>
-        <w:pStyle w:val="Normal"/>
-        <w:widowControl w:val="false"/>
-        <w:tabs>
-          <w:tab w:val="clear" w:pos="709"/>
-          <w:tab w:val="left" w:pos="2827" w:leader="none"/>
-        </w:tabs>
-        <w:spacing w:before="171" w:after="171"/>
-        <w:rPr>
-          <w:rFonts w:ascii="Helvetica Neue" w:hAnsi="Helvetica Neue"/>
-          <w:b/>
-          <w:bCs/>
-          <w:sz w:val="18"/>
-          <w:szCs w:val="18"/>
-          <w:lang w:val="de-DE" w:eastAsia="ru-RU"/>
-        </w:rPr>
-      </w:pPr>
-      <w:r>
-        <w:rPr>
-          <w:rFonts w:ascii="Helvetica Neue" w:hAnsi="Helvetica Neue"/>
-          <w:b/>
-          <w:bCs/>
-          <w:sz w:val="18"/>
-          <w:szCs w:val="18"/>
-          <w:lang w:val="de-DE" w:eastAsia="ru-RU"/>
-        </w:rPr>
-      </w:r>
-    </w:p>
-    <w:p>
-      <w:pPr>
-        <w:pStyle w:val="Normal"/>
-        <w:widowControl w:val="false"/>
-        <w:tabs>
-          <w:tab w:val="clear" w:pos="709"/>
-          <w:tab w:val="left" w:pos="2827" w:leader="none"/>
-        </w:tabs>
-        <w:spacing w:before="171" w:after="171"/>
-        <w:rPr>
-          <w:rFonts w:ascii="Helvetica Neue" w:hAnsi="Helvetica Neue"/>
-          <w:b/>
-          <w:bCs/>
-          <w:sz w:val="18"/>
-          <w:szCs w:val="18"/>
-          <w:lang w:val="de-DE" w:eastAsia="ru-RU"/>
-        </w:rPr>
-      </w:pPr>
-      <w:r>
-        <w:rPr>
-          <w:rFonts w:ascii="Helvetica Neue" w:hAnsi="Helvetica Neue"/>
-          <w:b/>
-          <w:bCs/>
-          <w:sz w:val="18"/>
-          <w:szCs w:val="18"/>
-          <w:lang w:val="de-DE" w:eastAsia="ru-RU"/>
-        </w:rPr>
-      </w:r>
-    </w:p>
-    <w:p>
-      <w:pPr>
-        <w:pStyle w:val="Normal"/>
-        <w:widowControl w:val="false"/>
-        <w:tabs>
-          <w:tab w:val="clear" w:pos="709"/>
-          <w:tab w:val="left" w:pos="2827" w:leader="none"/>
-        </w:tabs>
-        <w:spacing w:before="171" w:after="171"/>
-        <w:rPr>
-          <w:rFonts w:ascii="Helvetica Neue" w:hAnsi="Helvetica Neue"/>
-          <w:b/>
-          <w:bCs/>
-          <w:sz w:val="18"/>
-          <w:szCs w:val="18"/>
-          <w:lang w:val="de-DE" w:eastAsia="ru-RU"/>
-        </w:rPr>
-      </w:pPr>
-      <w:r>
-        <w:rPr>
-          <w:rFonts w:ascii="Helvetica Neue" w:hAnsi="Helvetica Neue"/>
-          <w:b/>
-          <w:bCs/>
-          <w:sz w:val="18"/>
-          <w:szCs w:val="18"/>
-          <w:lang w:val="de-DE" w:eastAsia="ru-RU"/>
-        </w:rPr>
-      </w:r>
-    </w:p>
-    <w:p>
-      <w:pPr>
-        <w:pStyle w:val="Normal"/>
-        <w:widowControl w:val="false"/>
-        <w:tabs>
-          <w:tab w:val="clear" w:pos="709"/>
-          <w:tab w:val="left" w:pos="2827" w:leader="none"/>
-        </w:tabs>
-        <w:spacing w:before="171" w:after="171"/>
-        <w:rPr>
-          <w:rFonts w:ascii="Helvetica Neue" w:hAnsi="Helvetica Neue"/>
-          <w:b/>
-          <w:bCs/>
-          <w:sz w:val="18"/>
-          <w:szCs w:val="18"/>
-          <w:lang w:val="de-DE" w:eastAsia="ru-RU"/>
-        </w:rPr>
-      </w:pPr>
-      <w:r>
-        <w:rPr>
-          <w:rFonts w:ascii="Helvetica Neue" w:hAnsi="Helvetica Neue"/>
-          <w:b/>
-          <w:bCs/>
-          <w:sz w:val="18"/>
-          <w:szCs w:val="18"/>
-          <w:lang w:val="de-DE" w:eastAsia="ru-RU"/>
         </w:rPr>
       </w:r>
     </w:p>
@@ -2425,13 +2190,13 @@
       <w:tblPr>
         <w:tblW w:w="9633" w:type="dxa"/>
         <w:jc w:val="left"/>
-        <w:tblInd w:w="55" w:type="dxa"/>
+        <w:tblInd w:w="0" w:type="dxa"/>
         <w:tblLayout w:type="fixed"/>
         <w:tblCellMar>
-          <w:top w:w="55" w:type="dxa"/>
-          <w:left w:w="55" w:type="dxa"/>
-          <w:bottom w:w="55" w:type="dxa"/>
-          <w:right w:w="55" w:type="dxa"/>
+          <w:top w:w="0" w:type="dxa"/>
+          <w:left w:w="0" w:type="dxa"/>
+          <w:bottom w:w="0" w:type="dxa"/>
+          <w:right w:w="0" w:type="dxa"/>
         </w:tblCellMar>
         <w:tblLook w:val="04a0" w:noVBand="1" w:noHBand="0" w:lastColumn="0" w:firstColumn="1" w:lastRow="0" w:firstRow="1"/>
       </w:tblPr>
@@ -2441,7 +2206,7 @@
       </w:tblGrid>
       <w:tr>
         <w:trPr>
-          <w:trHeight w:val="323" w:hRule="atLeast"/>
+          <w:trHeight w:val="265" w:hRule="atLeast"/>
         </w:trPr>
         <w:tc>
           <w:tcPr>
@@ -2594,29 +2359,27 @@
     </w:p>
     <w:tbl>
       <w:tblPr>
-        <w:tblW w:w="9633" w:type="dxa"/>
+        <w:tblW w:w="9634" w:type="dxa"/>
         <w:jc w:val="left"/>
-        <w:tblInd w:w="55" w:type="dxa"/>
+        <w:tblInd w:w="0" w:type="dxa"/>
         <w:tblLayout w:type="fixed"/>
         <w:tblCellMar>
-          <w:top w:w="55" w:type="dxa"/>
-          <w:left w:w="55" w:type="dxa"/>
-          <w:bottom w:w="55" w:type="dxa"/>
-          <w:right w:w="55" w:type="dxa"/>
+          <w:top w:w="0" w:type="dxa"/>
+          <w:left w:w="0" w:type="dxa"/>
+          <w:bottom w:w="0" w:type="dxa"/>
+          <w:right w:w="0" w:type="dxa"/>
         </w:tblCellMar>
         <w:tblLook w:val="04a0" w:noVBand="1" w:noHBand="0" w:lastColumn="0" w:firstColumn="1" w:lastRow="0" w:firstRow="1"/>
       </w:tblPr>
       <w:tblGrid>
-        <w:gridCol w:w="6228"/>
-        <w:gridCol w:w="3404"/>
+        <w:gridCol w:w="6307"/>
+        <w:gridCol w:w="3325"/>
       </w:tblGrid>
       <w:tr>
-        <w:trPr>
-          <w:trHeight w:val="323" w:hRule="atLeast"/>
-        </w:trPr>
+        <w:trPr/>
         <w:tc>
           <w:tcPr>
-            <w:tcW w:w="6228" w:type="dxa"/>
+            <w:tcW w:w="6307" w:type="dxa"/>
             <w:tcBorders>
               <w:top w:val="single" w:sz="4" w:space="0" w:color="000000"/>
               <w:left w:val="single" w:sz="4" w:space="0" w:color="000000"/>
@@ -2647,7 +2410,7 @@
         </w:tc>
         <w:tc>
           <w:tcPr>
-            <w:tcW w:w="3404" w:type="dxa"/>
+            <w:tcW w:w="3325" w:type="dxa"/>
             <w:tcBorders>
               <w:top w:val="single" w:sz="4" w:space="0" w:color="000000"/>
               <w:left w:val="single" w:sz="4" w:space="0" w:color="000000"/>
@@ -2700,7 +2463,7 @@
     <w:p>
       <w:pPr>
         <w:pStyle w:val="Normal"/>
-        <w:spacing w:lineRule="auto" w:line="276"/>
+        <w:spacing w:lineRule="auto" w:line="276" w:before="144" w:after="0"/>
         <w:rPr/>
       </w:pPr>
       <w:r>
@@ -2884,26 +2647,6 @@
     <w:p>
       <w:pPr>
         <w:pStyle w:val="Normal"/>
-        <w:spacing w:lineRule="auto" w:line="276"/>
-        <w:rPr>
-          <w:rFonts w:ascii="Helvetica Neue" w:hAnsi="Helvetica Neue" w:eastAsia="Arial" w:cs="Arial"/>
-          <w:sz w:val="18"/>
-          <w:szCs w:val="18"/>
-          <w:lang w:val="de-DE" w:eastAsia="ru-RU"/>
-        </w:rPr>
-      </w:pPr>
-      <w:r>
-        <w:rPr>
-          <w:rFonts w:eastAsia="Arial" w:cs="Arial" w:ascii="Helvetica Neue" w:hAnsi="Helvetica Neue"/>
-          <w:sz w:val="18"/>
-          <w:szCs w:val="18"/>
-          <w:lang w:val="de-DE" w:eastAsia="ru-RU"/>
-        </w:rPr>
-      </w:r>
-    </w:p>
-    <w:p>
-      <w:pPr>
-        <w:pStyle w:val="Normal"/>
         <w:spacing w:lineRule="auto" w:line="276" w:before="240" w:after="0"/>
         <w:rPr>
           <w:rFonts w:ascii="Helvetica Neue" w:hAnsi="Helvetica Neue"/>
@@ -2924,7 +2667,7 @@
     <w:p>
       <w:pPr>
         <w:pStyle w:val="Normal"/>
-        <w:spacing w:lineRule="auto" w:line="276" w:before="69" w:after="57"/>
+        <w:spacing w:lineRule="auto" w:line="276" w:before="72" w:after="0"/>
         <w:rPr>
           <w:rFonts w:ascii="Helvetica Neue" w:hAnsi="Helvetica Neue" w:eastAsia="Arial" w:cs="Arial"/>
           <w:sz w:val="18"/>
@@ -2993,58 +2736,6 @@
           <w:szCs w:val="18"/>
         </w:rPr>
         <w:t>{#AhShowHndHinweis}Zusätzlich können Sie haushaltsnahe Dienstleistungen buchen – zum Stundensatz von 40,56 €, zuzüglich einer Anfahrtspauschale von 7,96 €. Bei Bedarf wenden Sie sich bitte an unsere Koordination Alltagshilfe.{/AhShowHndHinweis}</w:t>
-      </w:r>
-    </w:p>
-    <w:p>
-      <w:pPr>
-        <w:pStyle w:val="Normal"/>
-        <w:numPr>
-          <w:ilvl w:val="0"/>
-          <w:numId w:val="0"/>
-        </w:numPr>
-        <w:spacing w:lineRule="auto" w:line="276"/>
-        <w:ind w:hanging="0" w:left="0"/>
-        <w:outlineLvl w:val="0"/>
-        <w:rPr>
-          <w:rFonts w:ascii="Helvetica Neue" w:hAnsi="Helvetica Neue"/>
-          <w:sz w:val="18"/>
-          <w:szCs w:val="18"/>
-          <w:lang w:val="de-DE" w:eastAsia="ru-RU"/>
-        </w:rPr>
-      </w:pPr>
-      <w:r>
-        <w:rPr>
-          <w:rFonts w:ascii="Helvetica Neue" w:hAnsi="Helvetica Neue"/>
-          <w:sz w:val="18"/>
-          <w:szCs w:val="18"/>
-          <w:lang w:val="de-DE" w:eastAsia="ru-RU"/>
-        </w:rPr>
-      </w:r>
-    </w:p>
-    <w:p>
-      <w:pPr>
-        <w:pStyle w:val="Normal"/>
-        <w:numPr>
-          <w:ilvl w:val="0"/>
-          <w:numId w:val="0"/>
-        </w:numPr>
-        <w:spacing w:lineRule="auto" w:line="276"/>
-        <w:ind w:hanging="0" w:left="0"/>
-        <w:outlineLvl w:val="0"/>
-        <w:rPr>
-          <w:rFonts w:ascii="Helvetica Neue" w:hAnsi="Helvetica Neue"/>
-          <w:sz w:val="18"/>
-          <w:szCs w:val="18"/>
-          <w:lang w:val="de-DE" w:eastAsia="ru-RU"/>
-        </w:rPr>
-      </w:pPr>
-      <w:r>
-        <w:rPr>
-          <w:rFonts w:ascii="Helvetica Neue" w:hAnsi="Helvetica Neue"/>
-          <w:sz w:val="18"/>
-          <w:szCs w:val="18"/>
-          <w:lang w:val="de-DE" w:eastAsia="ru-RU"/>
-        </w:rPr>
       </w:r>
     </w:p>
     <w:p>
@@ -5033,8 +4724,8 @@
       <w:u w:val="single"/>
     </w:rPr>
   </w:style>
-  <w:style w:type="character" w:styleId="FootnoteCharactersuser" w:customStyle="1">
-    <w:name w:val="Footnote Characters (user)"/>
+  <w:style w:type="character" w:styleId="FootnoteCharacters" w:customStyle="1">
+    <w:name w:val="Footnote Characters"/>
     <w:qFormat/>
     <w:rPr>
       <w:vertAlign w:val="superscript"/>
@@ -5047,8 +4738,8 @@
       <w:vertAlign w:val="superscript"/>
     </w:rPr>
   </w:style>
-  <w:style w:type="character" w:styleId="FootnoteCharacters">
-    <w:name w:val="Footnote Characters"/>
+  <w:style w:type="character" w:styleId="FootnoteCharactersuser">
+    <w:name w:val="Footnote Characters (user)"/>
     <w:qFormat/>
     <w:rPr>
       <w:vertAlign w:val="superscript"/>
@@ -5095,8 +4786,8 @@
       <w:vertAlign w:val="superscript"/>
     </w:rPr>
   </w:style>
-  <w:style w:type="character" w:styleId="EndnoteCharactersuser" w:customStyle="1">
-    <w:name w:val="Endnote Characters (user)"/>
+  <w:style w:type="character" w:styleId="EndnoteCharacters" w:customStyle="1">
+    <w:name w:val="Endnote Characters"/>
     <w:qFormat/>
     <w:rPr>
       <w:vertAlign w:val="superscript"/>
@@ -5109,8 +4800,8 @@
       <w:vertAlign w:val="superscript"/>
     </w:rPr>
   </w:style>
-  <w:style w:type="character" w:styleId="EndnoteCharacters">
-    <w:name w:val="Endnote Characters"/>
+  <w:style w:type="character" w:styleId="EndnoteCharactersuser">
+    <w:name w:val="Endnote Characters (user)"/>
     <w:qFormat/>
     <w:rPr>
       <w:vertAlign w:val="superscript"/>
@@ -5346,8 +5037,8 @@
     <w:qFormat/>
     <w:rPr/>
   </w:style>
-  <w:style w:type="character" w:styleId="Bulletsuser" w:customStyle="1">
-    <w:name w:val="Bullets (user)"/>
+  <w:style w:type="character" w:styleId="Bullets" w:customStyle="1">
+    <w:name w:val="Bullets"/>
     <w:qFormat/>
     <w:rPr>
       <w:rFonts w:ascii="OpenSymbol" w:hAnsi="OpenSymbol" w:eastAsia="OpenSymbol" w:cs="OpenSymbol"/>
@@ -5836,8 +5527,8 @@
       <w:bCs/>
     </w:rPr>
   </w:style>
-  <w:style w:type="paragraph" w:styleId="FrameContentsuser" w:customStyle="1">
-    <w:name w:val="Frame Contents (user)"/>
+  <w:style w:type="paragraph" w:styleId="FrameContents" w:customStyle="1">
+    <w:name w:val="Frame Contents"/>
     <w:basedOn w:val="Normal"/>
     <w:qFormat/>
     <w:pPr/>

</xml_diff>

<commit_message>
feat(ah-pdf): Abzugszeile Entlastungsbetrag über dem Eigenanteil
AH-Angebot.docx: zwischen Gesamtbetrag und "Ihr Eigenanteil" steht jetzt
"abzgl. Entlastungsbetrag § 45b SGB XI  –131,00 €". Beide Zeilen hängen
gemeinsam an {#AhHasEigenanteil} und entfallen zusammen, wenn der
Entlastungsbetrag nicht bestätigt ist. Nutzt das bereits vorhandene Feld
AhEntlastungsbetrag – keine Code-Änderung nötig.

Co-Authored-By: Claude <noreply@anthropic.com>
</commit_message>
<xml_diff>
--- a/src/templates/AH-Angebot.docx
+++ b/src/templates/AH-Angebot.docx
@@ -7,14 +7,14 @@
       <w:pPr>
         <w:pStyle w:val="Normal"/>
         <w:rPr>
-          <w:rFonts w:ascii="Jubilat" w:hAnsi="Jubilat" w:eastAsia="Dotum" w:cs="Dotum"/>
+          <w:rFonts w:ascii="Open Sans" w:hAnsi="Open Sans" w:eastAsia="Dotum" w:cs="Dotum"/>
           <w:sz w:val="18"/>
           <w:szCs w:val="18"/>
         </w:rPr>
       </w:pPr>
       <w:r>
         <w:rPr>
-          <w:rFonts w:eastAsia="Dotum" w:cs="Dotum" w:ascii="Jubilat" w:hAnsi="Jubilat"/>
+          <w:rFonts w:eastAsia="Dotum" w:cs="Dotum" w:ascii="Open Sans" w:hAnsi="Open Sans"/>
           <w:sz w:val="18"/>
           <w:szCs w:val="18"/>
         </w:rPr>
@@ -24,14 +24,14 @@
       <w:pPr>
         <w:pStyle w:val="Normal"/>
         <w:rPr>
-          <w:rFonts w:ascii="Jubilat" w:hAnsi="Jubilat" w:eastAsia="Dotum" w:cs="Dotum"/>
+          <w:rFonts w:ascii="Open Sans" w:hAnsi="Open Sans" w:eastAsia="Dotum" w:cs="Dotum"/>
           <w:sz w:val="18"/>
           <w:szCs w:val="18"/>
         </w:rPr>
       </w:pPr>
       <w:r>
         <w:rPr>
-          <w:rFonts w:eastAsia="Dotum" w:cs="Dotum" w:ascii="Jubilat" w:hAnsi="Jubilat"/>
+          <w:rFonts w:eastAsia="Dotum" w:cs="Dotum" w:ascii="Open Sans" w:hAnsi="Open Sans"/>
           <w:sz w:val="18"/>
           <w:szCs w:val="18"/>
         </w:rPr>
@@ -41,14 +41,14 @@
       <w:pPr>
         <w:pStyle w:val="Normal"/>
         <w:rPr>
-          <w:rFonts w:ascii="Jubilat" w:hAnsi="Jubilat" w:eastAsia="Dotum" w:cs="Dotum"/>
+          <w:rFonts w:ascii="Open Sans" w:hAnsi="Open Sans" w:eastAsia="Dotum" w:cs="Dotum"/>
           <w:sz w:val="18"/>
           <w:szCs w:val="18"/>
         </w:rPr>
       </w:pPr>
       <w:r>
         <w:rPr>
-          <w:rFonts w:eastAsia="Dotum" w:cs="Dotum" w:ascii="Jubilat" w:hAnsi="Jubilat"/>
+          <w:rFonts w:eastAsia="Dotum" w:cs="Dotum" w:ascii="Open Sans" w:hAnsi="Open Sans"/>
           <w:sz w:val="18"/>
           <w:szCs w:val="18"/>
         </w:rPr>
@@ -58,14 +58,14 @@
       <w:pPr>
         <w:pStyle w:val="Normal"/>
         <w:rPr>
-          <w:rFonts w:ascii="Jubilat" w:hAnsi="Jubilat" w:eastAsia="Dotum" w:cs="Dotum"/>
+          <w:rFonts w:ascii="Open Sans" w:hAnsi="Open Sans" w:eastAsia="Dotum" w:cs="Dotum"/>
           <w:sz w:val="18"/>
           <w:szCs w:val="18"/>
         </w:rPr>
       </w:pPr>
       <w:r>
         <w:rPr>
-          <w:rFonts w:eastAsia="Dotum" w:cs="Dotum" w:ascii="Jubilat" w:hAnsi="Jubilat"/>
+          <w:rFonts w:eastAsia="Dotum" w:cs="Dotum" w:ascii="Open Sans" w:hAnsi="Open Sans"/>
           <w:sz w:val="18"/>
           <w:szCs w:val="18"/>
         </w:rPr>
@@ -75,14 +75,14 @@
       <w:pPr>
         <w:pStyle w:val="Normal"/>
         <w:rPr>
-          <w:rFonts w:ascii="Jubilat" w:hAnsi="Jubilat" w:eastAsia="Dotum" w:cs="Dotum"/>
+          <w:rFonts w:ascii="Open Sans" w:hAnsi="Open Sans" w:eastAsia="Dotum" w:cs="Dotum"/>
           <w:sz w:val="18"/>
           <w:szCs w:val="18"/>
         </w:rPr>
       </w:pPr>
       <w:r>
         <w:rPr>
-          <w:rFonts w:eastAsia="Dotum" w:cs="Dotum" w:ascii="Jubilat" w:hAnsi="Jubilat"/>
+          <w:rFonts w:eastAsia="Dotum" w:cs="Dotum" w:ascii="Open Sans" w:hAnsi="Open Sans"/>
           <w:sz w:val="18"/>
           <w:szCs w:val="18"/>
         </w:rPr>
@@ -92,14 +92,14 @@
       <w:pPr>
         <w:pStyle w:val="Normal"/>
         <w:rPr>
-          <w:rFonts w:ascii="Jubilat" w:hAnsi="Jubilat" w:eastAsia="Dotum" w:cs="Dotum"/>
+          <w:rFonts w:ascii="Open Sans" w:hAnsi="Open Sans" w:eastAsia="Dotum" w:cs="Dotum"/>
           <w:sz w:val="18"/>
           <w:szCs w:val="18"/>
         </w:rPr>
       </w:pPr>
       <w:r>
         <w:rPr>
-          <w:rFonts w:eastAsia="Dotum" w:cs="Dotum" w:ascii="Jubilat" w:hAnsi="Jubilat"/>
+          <w:rFonts w:eastAsia="Dotum" w:cs="Dotum" w:ascii="Open Sans" w:hAnsi="Open Sans"/>
           <w:sz w:val="18"/>
           <w:szCs w:val="18"/>
         </w:rPr>
@@ -121,8 +121,8 @@
       </w:tblPr>
       <w:tblGrid>
         <w:gridCol w:w="5686"/>
-        <w:gridCol w:w="1704"/>
-        <w:gridCol w:w="2525"/>
+        <w:gridCol w:w="1702"/>
+        <w:gridCol w:w="2527"/>
       </w:tblGrid>
       <w:tr>
         <w:trPr>
@@ -141,15 +141,12 @@
               <w:widowControl w:val="false"/>
               <w:ind w:firstLine="109" w:left="-109"/>
               <w:rPr>
-                <w:rFonts w:ascii="Jubilat" w:hAnsi="Jubilat"/>
-                <w:sz w:val="13"/>
-                <w:szCs w:val="13"/>
-                <w:lang w:val="de-DE"/>
+                <w:rFonts w:ascii="Open Sans" w:hAnsi="Open Sans"/>
               </w:rPr>
             </w:pPr>
             <w:r>
               <w:rPr>
-                <w:rFonts w:eastAsia="Cambria" w:cs="Arial" w:ascii="Jubilat" w:hAnsi="Jubilat"/>
+                <w:rFonts w:eastAsia="Cambria" w:cs="Arial" w:ascii="Open Sans" w:hAnsi="Open Sans"/>
                 <w:sz w:val="13"/>
                 <w:szCs w:val="13"/>
                 <w:lang w:val="de-DE" w:eastAsia="ru-RU"/>
@@ -158,7 +155,7 @@
             </w:r>
             <w:r>
               <w:rPr>
-                <w:rFonts w:eastAsia="Cambria" w:cs="Arial" w:ascii="Helvetica Neue" w:hAnsi="Helvetica Neue"/>
+                <w:rFonts w:eastAsia="Cambria" w:cs="Arial" w:ascii="Open Sans" w:hAnsi="Open Sans"/>
                 <w:sz w:val="13"/>
                 <w:szCs w:val="13"/>
                 <w:lang w:val="de-DE" w:eastAsia="ru-RU"/>
@@ -183,7 +180,7 @@
               <w:pStyle w:val="Normal"/>
               <w:widowControl w:val="false"/>
               <w:rPr>
-                <w:rFonts w:ascii="Helvetica Neue" w:hAnsi="Helvetica Neue" w:eastAsia="Arial" w:cs="Arial"/>
+                <w:rFonts w:ascii="Open Sans" w:hAnsi="Open Sans" w:eastAsia="Arial" w:cs="Arial"/>
                 <w:sz w:val="18"/>
                 <w:szCs w:val="18"/>
                 <w:lang w:val="de-DE"/>
@@ -191,7 +188,7 @@
             </w:pPr>
             <w:r>
               <w:rPr>
-                <w:rFonts w:eastAsia="Arial" w:cs="Arial" w:ascii="Helvetica Neue" w:hAnsi="Helvetica Neue"/>
+                <w:rFonts w:eastAsia="Arial" w:cs="Arial" w:ascii="Open Sans" w:hAnsi="Open Sans"/>
                 <w:sz w:val="18"/>
                 <w:szCs w:val="18"/>
                 <w:lang w:val="de-DE"/>
@@ -211,7 +208,7 @@
               <w:pStyle w:val="Normal"/>
               <w:widowControl w:val="false"/>
               <w:rPr>
-                <w:rFonts w:ascii="Jubilat" w:hAnsi="Jubilat" w:eastAsia="Arial" w:cs="Arial"/>
+                <w:rFonts w:ascii="Open Sans" w:hAnsi="Open Sans" w:eastAsia="Arial" w:cs="Arial"/>
                 <w:sz w:val="18"/>
                 <w:szCs w:val="18"/>
                 <w:lang w:val="de-DE"/>
@@ -219,7 +216,7 @@
             </w:pPr>
             <w:r>
               <w:rPr>
-                <w:rFonts w:eastAsia="Arial" w:cs="Arial" w:ascii="Jubilat" w:hAnsi="Jubilat"/>
+                <w:rFonts w:eastAsia="Arial" w:cs="Arial" w:ascii="Open Sans" w:hAnsi="Open Sans"/>
                 <w:sz w:val="18"/>
                 <w:szCs w:val="18"/>
                 <w:lang w:val="de-DE"/>
@@ -230,7 +227,7 @@
       </w:tr>
       <w:tr>
         <w:trPr>
-          <w:trHeight w:val="136" w:hRule="atLeast"/>
+          <w:trHeight w:val="1758" w:hRule="atLeast"/>
         </w:trPr>
         <w:tc>
           <w:tcPr>
@@ -241,24 +238,28 @@
           <w:p>
             <w:pPr>
               <w:pStyle w:val="Normal"/>
+              <w:widowControl/>
               <w:tabs>
                 <w:tab w:val="clear" w:pos="709"/>
                 <w:tab w:val="left" w:pos="0" w:leader="none"/>
               </w:tabs>
-              <w:spacing w:before="0" w:after="20"/>
+              <w:suppressAutoHyphens w:val="false"/>
+              <w:bidi w:val="0"/>
+              <w:spacing w:before="58" w:after="0"/>
+              <w:ind w:hanging="0" w:left="29" w:right="0"/>
+              <w:jc w:val="left"/>
               <w:rPr>
-                <w:rFonts w:ascii="Helvetica Neue" w:hAnsi="Helvetica Neue"/>
-                <w:color w:val="000000"/>
-                <w:sz w:val="17"/>
-                <w:szCs w:val="17"/>
+                <w:rFonts w:ascii="Open Sans" w:hAnsi="Open Sans"/>
+                <w:sz w:val="18"/>
+                <w:szCs w:val="18"/>
               </w:rPr>
             </w:pPr>
             <w:r>
               <w:rPr>
-                <w:rFonts w:eastAsia="Open Sans" w:cs="Open Sans" w:ascii="Helvetica Neue" w:hAnsi="Helvetica Neue"/>
+                <w:rFonts w:eastAsia="Open Sans" w:cs="Open Sans" w:ascii="Open Sans" w:hAnsi="Open Sans"/>
                 <w:color w:val="000000"/>
-                <w:sz w:val="17"/>
-                <w:szCs w:val="17"/>
+                <w:sz w:val="18"/>
+                <w:szCs w:val="18"/>
               </w:rPr>
               <w:t>{Anrede}</w:t>
             </w:r>
@@ -266,26 +267,30 @@
           <w:p>
             <w:pPr>
               <w:pStyle w:val="Normal"/>
+              <w:widowControl/>
               <w:tabs>
                 <w:tab w:val="clear" w:pos="709"/>
                 <w:tab w:val="left" w:pos="0" w:leader="none"/>
               </w:tabs>
-              <w:spacing w:before="0" w:after="20"/>
+              <w:suppressAutoHyphens w:val="false"/>
+              <w:bidi w:val="0"/>
+              <w:spacing w:before="58" w:after="0"/>
+              <w:ind w:hanging="0" w:left="29" w:right="0"/>
+              <w:jc w:val="left"/>
               <w:rPr>
-                <w:rFonts w:ascii="Helvetica Neue" w:hAnsi="Helvetica Neue"/>
-                <w:color w:val="000000"/>
-                <w:sz w:val="17"/>
-                <w:szCs w:val="17"/>
+                <w:rFonts w:ascii="Open Sans" w:hAnsi="Open Sans"/>
+                <w:sz w:val="18"/>
+                <w:szCs w:val="18"/>
               </w:rPr>
             </w:pPr>
             <w:r>
               <w:rPr>
-                <w:rFonts w:ascii="Helvetica Neue" w:hAnsi="Helvetica Neue"/>
+                <w:rFonts w:ascii="Open Sans" w:hAnsi="Open Sans"/>
                 <w:b/>
                 <w:bCs/>
                 <w:color w:val="000000"/>
-                <w:sz w:val="17"/>
-                <w:szCs w:val="17"/>
+                <w:sz w:val="18"/>
+                <w:szCs w:val="18"/>
               </w:rPr>
               <w:t>{Vorname} {Nachname}</w:t>
             </w:r>
@@ -293,24 +298,28 @@
           <w:p>
             <w:pPr>
               <w:pStyle w:val="Normal"/>
+              <w:widowControl/>
               <w:tabs>
                 <w:tab w:val="clear" w:pos="709"/>
                 <w:tab w:val="left" w:pos="0" w:leader="none"/>
               </w:tabs>
-              <w:spacing w:before="0" w:after="20"/>
+              <w:suppressAutoHyphens w:val="false"/>
+              <w:bidi w:val="0"/>
+              <w:spacing w:before="58" w:after="0"/>
+              <w:ind w:hanging="0" w:left="29" w:right="0"/>
+              <w:jc w:val="left"/>
               <w:rPr>
-                <w:rFonts w:ascii="Helvetica Neue" w:hAnsi="Helvetica Neue"/>
-                <w:color w:val="000000"/>
-                <w:sz w:val="17"/>
-                <w:szCs w:val="17"/>
+                <w:rFonts w:ascii="Open Sans" w:hAnsi="Open Sans"/>
+                <w:sz w:val="18"/>
+                <w:szCs w:val="18"/>
               </w:rPr>
             </w:pPr>
             <w:r>
               <w:rPr>
-                <w:rFonts w:eastAsia="Open Sans" w:cs="Open Sans" w:ascii="Helvetica Neue" w:hAnsi="Helvetica Neue"/>
+                <w:rFonts w:eastAsia="Open Sans" w:cs="Open Sans" w:ascii="Open Sans" w:hAnsi="Open Sans"/>
                 <w:color w:val="000000"/>
-                <w:sz w:val="17"/>
-                <w:szCs w:val="17"/>
+                <w:sz w:val="18"/>
+                <w:szCs w:val="18"/>
               </w:rPr>
               <w:t>{Adresse}</w:t>
             </w:r>
@@ -318,24 +327,28 @@
           <w:p>
             <w:pPr>
               <w:pStyle w:val="Normal"/>
+              <w:widowControl/>
               <w:tabs>
                 <w:tab w:val="clear" w:pos="709"/>
                 <w:tab w:val="left" w:pos="0" w:leader="none"/>
               </w:tabs>
-              <w:spacing w:before="0" w:after="20"/>
+              <w:suppressAutoHyphens w:val="false"/>
+              <w:bidi w:val="0"/>
+              <w:spacing w:before="58" w:after="0"/>
+              <w:ind w:hanging="0" w:left="29" w:right="0"/>
+              <w:jc w:val="left"/>
               <w:rPr>
-                <w:rFonts w:ascii="Helvetica Neue" w:hAnsi="Helvetica Neue"/>
-                <w:color w:val="000000"/>
-                <w:sz w:val="17"/>
-                <w:szCs w:val="17"/>
+                <w:rFonts w:ascii="Open Sans" w:hAnsi="Open Sans"/>
+                <w:sz w:val="18"/>
+                <w:szCs w:val="18"/>
               </w:rPr>
             </w:pPr>
             <w:r>
               <w:rPr>
-                <w:rFonts w:eastAsia="Open Sans" w:cs="Open Sans" w:ascii="Helvetica Neue" w:hAnsi="Helvetica Neue"/>
+                <w:rFonts w:eastAsia="Open Sans" w:cs="Open Sans" w:ascii="Open Sans" w:hAnsi="Open Sans"/>
                 <w:color w:val="000000"/>
-                <w:sz w:val="17"/>
-                <w:szCs w:val="17"/>
+                <w:sz w:val="18"/>
+                <w:szCs w:val="18"/>
                 <w:lang w:val="de-DE" w:eastAsia="ru-RU"/>
               </w:rPr>
               <w:t>{PLZ} {Stadt}</w:t>
@@ -344,7 +357,7 @@
         </w:tc>
         <w:tc>
           <w:tcPr>
-            <w:tcW w:w="1704" w:type="dxa"/>
+            <w:tcW w:w="1702" w:type="dxa"/>
             <w:tcBorders/>
             <w:shd w:color="auto" w:fill="auto" w:val="clear"/>
           </w:tcPr>
@@ -356,18 +369,17 @@
                 <w:tab w:val="left" w:pos="0" w:leader="none"/>
               </w:tabs>
               <w:suppressAutoHyphens w:val="true"/>
-              <w:spacing w:before="0" w:after="0"/>
+              <w:spacing w:before="58" w:after="0"/>
               <w:jc w:val="left"/>
               <w:rPr>
-                <w:rFonts w:ascii="Helvetica Neue" w:hAnsi="Helvetica Neue"/>
-                <w:sz w:val="18"/>
-                <w:szCs w:val="18"/>
+                <w:rFonts w:ascii="Open Sans" w:hAnsi="Open Sans"/>
+                <w:color w:val="000000"/>
               </w:rPr>
             </w:pPr>
             <w:r>
               <w:rPr>
-                <w:rFonts w:eastAsia="Open Sans" w:cs="Open Sans" w:ascii="Helvetica Neue" w:hAnsi="Helvetica Neue"/>
-                <w:color w:val="555555"/>
+                <w:rFonts w:eastAsia="Open Sans" w:cs="Open Sans" w:ascii="Open Sans" w:hAnsi="Open Sans"/>
+                <w:color w:val="000000"/>
                 <w:kern w:val="0"/>
                 <w:sz w:val="18"/>
                 <w:szCs w:val="18"/>
@@ -384,18 +396,17 @@
                 <w:tab w:val="left" w:pos="0" w:leader="none"/>
               </w:tabs>
               <w:suppressAutoHyphens w:val="true"/>
-              <w:spacing w:before="0" w:after="0"/>
+              <w:spacing w:before="58" w:after="0"/>
               <w:jc w:val="left"/>
               <w:rPr>
-                <w:rFonts w:ascii="Helvetica Neue" w:hAnsi="Helvetica Neue"/>
-                <w:sz w:val="18"/>
-                <w:szCs w:val="18"/>
+                <w:rFonts w:ascii="Open Sans" w:hAnsi="Open Sans"/>
+                <w:color w:val="000000"/>
               </w:rPr>
             </w:pPr>
             <w:r>
               <w:rPr>
-                <w:rFonts w:ascii="Helvetica Neue" w:hAnsi="Helvetica Neue"/>
-                <w:color w:val="555555"/>
+                <w:rFonts w:ascii="Open Sans" w:hAnsi="Open Sans"/>
+                <w:color w:val="000000"/>
                 <w:sz w:val="18"/>
                 <w:szCs w:val="18"/>
               </w:rPr>
@@ -410,17 +421,17 @@
                 <w:tab w:val="left" w:pos="0" w:leader="none"/>
               </w:tabs>
               <w:suppressAutoHyphens w:val="true"/>
-              <w:spacing w:before="0" w:after="0"/>
+              <w:spacing w:before="58" w:after="0"/>
               <w:jc w:val="left"/>
               <w:rPr>
-                <w:rFonts w:ascii="Helvetica Neue" w:hAnsi="Helvetica Neue"/>
-                <w:sz w:val="18"/>
-                <w:szCs w:val="18"/>
+                <w:rFonts w:ascii="Open Sans" w:hAnsi="Open Sans"/>
+                <w:color w:val="000000"/>
               </w:rPr>
             </w:pPr>
             <w:r>
               <w:rPr>
-                <w:rFonts w:eastAsia="Open Sans" w:cs="Open Sans" w:ascii="Helvetica Neue" w:hAnsi="Helvetica Neue"/>
+                <w:rFonts w:eastAsia="Open Sans" w:cs="Open Sans" w:ascii="Open Sans" w:hAnsi="Open Sans"/>
+                <w:color w:val="000000"/>
                 <w:kern w:val="0"/>
                 <w:sz w:val="18"/>
                 <w:szCs w:val="18"/>
@@ -437,18 +448,17 @@
                 <w:tab w:val="left" w:pos="0" w:leader="none"/>
               </w:tabs>
               <w:suppressAutoHyphens w:val="true"/>
-              <w:spacing w:before="0" w:after="0"/>
+              <w:spacing w:before="58" w:after="0"/>
               <w:jc w:val="left"/>
               <w:rPr>
-                <w:rFonts w:ascii="Helvetica Neue" w:hAnsi="Helvetica Neue"/>
-                <w:sz w:val="18"/>
-                <w:szCs w:val="18"/>
+                <w:rFonts w:ascii="Open Sans" w:hAnsi="Open Sans"/>
+                <w:color w:val="000000"/>
               </w:rPr>
             </w:pPr>
             <w:r>
               <w:rPr>
-                <w:rFonts w:ascii="Helvetica Neue" w:hAnsi="Helvetica Neue"/>
-                <w:color w:val="555555"/>
+                <w:rFonts w:ascii="Open Sans" w:hAnsi="Open Sans"/>
+                <w:color w:val="000000"/>
                 <w:sz w:val="18"/>
                 <w:szCs w:val="18"/>
               </w:rPr>
@@ -459,73 +469,16 @@
             <w:pPr>
               <w:pStyle w:val="Normal"/>
               <w:widowControl w:val="false"/>
-              <w:spacing w:lineRule="auto" w:line="360"/>
+              <w:spacing w:lineRule="auto" w:line="360" w:before="58" w:after="0"/>
               <w:rPr>
-                <w:rFonts w:ascii="Helvetica Neue" w:hAnsi="Helvetica Neue" w:eastAsia="Arial" w:cs="Arial"/>
+                <w:rFonts w:ascii="Open Sans" w:hAnsi="Open Sans" w:eastAsia="Arial" w:cs="Arial"/>
                 <w:sz w:val="18"/>
                 <w:szCs w:val="18"/>
               </w:rPr>
             </w:pPr>
             <w:r>
               <w:rPr>
-                <w:rFonts w:eastAsia="Arial" w:cs="Arial" w:ascii="Helvetica Neue" w:hAnsi="Helvetica Neue"/>
-                <w:sz w:val="18"/>
-                <w:szCs w:val="18"/>
-              </w:rPr>
-            </w:r>
-          </w:p>
-          <w:p>
-            <w:pPr>
-              <w:pStyle w:val="Normal"/>
-              <w:widowControl w:val="false"/>
-              <w:spacing w:lineRule="auto" w:line="360"/>
-              <w:rPr>
-                <w:rFonts w:ascii="Helvetica Neue" w:hAnsi="Helvetica Neue" w:eastAsia="Arial" w:cs="Arial"/>
-                <w:sz w:val="18"/>
-                <w:szCs w:val="18"/>
-              </w:rPr>
-            </w:pPr>
-            <w:r>
-              <w:rPr>
-                <w:rFonts w:eastAsia="Arial" w:cs="Arial" w:ascii="Helvetica Neue" w:hAnsi="Helvetica Neue"/>
-                <w:sz w:val="18"/>
-                <w:szCs w:val="18"/>
-              </w:rPr>
-            </w:r>
-          </w:p>
-          <w:p>
-            <w:pPr>
-              <w:pStyle w:val="Normal"/>
-              <w:widowControl w:val="false"/>
-              <w:spacing w:lineRule="auto" w:line="360"/>
-              <w:rPr>
-                <w:rFonts w:ascii="Helvetica Neue" w:hAnsi="Helvetica Neue" w:eastAsia="Arial" w:cs="Arial"/>
-                <w:sz w:val="18"/>
-                <w:szCs w:val="18"/>
-              </w:rPr>
-            </w:pPr>
-            <w:r>
-              <w:rPr>
-                <w:rFonts w:eastAsia="Arial" w:cs="Arial" w:ascii="Helvetica Neue" w:hAnsi="Helvetica Neue"/>
-                <w:sz w:val="18"/>
-                <w:szCs w:val="18"/>
-              </w:rPr>
-            </w:r>
-          </w:p>
-          <w:p>
-            <w:pPr>
-              <w:pStyle w:val="Normal"/>
-              <w:widowControl w:val="false"/>
-              <w:spacing w:lineRule="auto" w:line="360"/>
-              <w:rPr>
-                <w:rFonts w:ascii="Helvetica Neue" w:hAnsi="Helvetica Neue" w:eastAsia="Arial" w:cs="Arial"/>
-                <w:sz w:val="18"/>
-                <w:szCs w:val="18"/>
-              </w:rPr>
-            </w:pPr>
-            <w:r>
-              <w:rPr>
-                <w:rFonts w:eastAsia="Arial" w:cs="Arial" w:ascii="Helvetica Neue" w:hAnsi="Helvetica Neue"/>
+                <w:rFonts w:eastAsia="Arial" w:cs="Arial" w:ascii="Open Sans" w:hAnsi="Open Sans"/>
                 <w:sz w:val="18"/>
                 <w:szCs w:val="18"/>
               </w:rPr>
@@ -534,7 +487,7 @@
         </w:tc>
         <w:tc>
           <w:tcPr>
-            <w:tcW w:w="2525" w:type="dxa"/>
+            <w:tcW w:w="2527" w:type="dxa"/>
             <w:tcBorders/>
             <w:shd w:color="auto" w:fill="auto" w:val="clear"/>
           </w:tcPr>
@@ -546,17 +499,15 @@
                 <w:tab w:val="left" w:pos="0" w:leader="none"/>
               </w:tabs>
               <w:suppressAutoHyphens w:val="true"/>
-              <w:spacing w:before="0" w:after="0"/>
+              <w:spacing w:before="58" w:after="0"/>
               <w:jc w:val="left"/>
               <w:rPr>
-                <w:rFonts w:ascii="Helvetica Neue" w:hAnsi="Helvetica Neue"/>
-                <w:sz w:val="18"/>
-                <w:szCs w:val="18"/>
+                <w:rFonts w:ascii="Open Sans" w:hAnsi="Open Sans"/>
               </w:rPr>
             </w:pPr>
             <w:r>
               <w:rPr>
-                <w:rFonts w:ascii="Helvetica Neue" w:hAnsi="Helvetica Neue"/>
+                <w:rFonts w:ascii="Open Sans" w:hAnsi="Open Sans"/>
                 <w:kern w:val="0"/>
                 <w:sz w:val="18"/>
                 <w:szCs w:val="18"/>
@@ -573,18 +524,15 @@
                 <w:tab w:val="left" w:pos="0" w:leader="none"/>
               </w:tabs>
               <w:suppressAutoHyphens w:val="true"/>
-              <w:spacing w:lineRule="auto" w:line="240" w:before="0" w:after="0"/>
+              <w:spacing w:lineRule="auto" w:line="240" w:before="58" w:after="0"/>
               <w:jc w:val="left"/>
               <w:rPr>
-                <w:rFonts w:ascii="Helvetica Neue" w:hAnsi="Helvetica Neue" w:eastAsia="Open Sans" w:cs="Open Sans"/>
-                <w:color w:val="070707"/>
-                <w:sz w:val="18"/>
-                <w:szCs w:val="18"/>
+                <w:rFonts w:ascii="Open Sans" w:hAnsi="Open Sans"/>
               </w:rPr>
             </w:pPr>
             <w:r>
               <w:rPr>
-                <w:rFonts w:eastAsia="Open Sans" w:cs="Open Sans" w:ascii="Helvetica Neue" w:hAnsi="Helvetica Neue"/>
+                <w:rFonts w:eastAsia="Open Sans" w:cs="Open Sans" w:ascii="Open Sans" w:hAnsi="Open Sans"/>
                 <w:color w:val="070707"/>
                 <w:sz w:val="18"/>
                 <w:szCs w:val="18"/>
@@ -599,16 +547,14 @@
                 <w:tab w:val="clear" w:pos="709"/>
                 <w:tab w:val="left" w:pos="0" w:leader="none"/>
               </w:tabs>
-              <w:spacing w:lineRule="auto" w:line="240"/>
+              <w:spacing w:lineRule="auto" w:line="240" w:before="58" w:after="0"/>
               <w:rPr>
-                <w:rFonts w:ascii="Helvetica Neue" w:hAnsi="Helvetica Neue"/>
-                <w:sz w:val="18"/>
-                <w:szCs w:val="18"/>
+                <w:rFonts w:ascii="Open Sans" w:hAnsi="Open Sans"/>
               </w:rPr>
             </w:pPr>
             <w:r>
               <w:rPr>
-                <w:rFonts w:ascii="Helvetica Neue" w:hAnsi="Helvetica Neue"/>
+                <w:rFonts w:ascii="Open Sans" w:hAnsi="Open Sans"/>
                 <w:kern w:val="0"/>
                 <w:sz w:val="18"/>
                 <w:szCs w:val="18"/>
@@ -625,109 +571,21 @@
                 <w:tab w:val="left" w:pos="0" w:leader="none"/>
               </w:tabs>
               <w:suppressAutoHyphens w:val="true"/>
-              <w:spacing w:before="0" w:after="0"/>
+              <w:spacing w:before="58" w:after="0"/>
               <w:jc w:val="left"/>
               <w:rPr>
-                <w:rFonts w:ascii="Helvetica Neue" w:hAnsi="Helvetica Neue"/>
-                <w:sz w:val="18"/>
-                <w:szCs w:val="18"/>
+                <w:rFonts w:ascii="Open Sans" w:hAnsi="Open Sans"/>
               </w:rPr>
             </w:pPr>
             <w:r>
               <w:rPr>
-                <w:rFonts w:ascii="Helvetica Neue" w:hAnsi="Helvetica Neue"/>
+                <w:rFonts w:ascii="Open Sans" w:hAnsi="Open Sans"/>
                 <w:kern w:val="0"/>
                 <w:sz w:val="18"/>
                 <w:szCs w:val="18"/>
                 <w:lang w:val="pl-PL" w:eastAsia="en-US" w:bidi="ar-SA"/>
               </w:rPr>
               <w:t>{Ansprechpartner}</w:t>
-            </w:r>
-          </w:p>
-          <w:p>
-            <w:pPr>
-              <w:pStyle w:val="Normal"/>
-              <w:tabs>
-                <w:tab w:val="clear" w:pos="709"/>
-                <w:tab w:val="left" w:pos="0" w:leader="none"/>
-              </w:tabs>
-              <w:suppressAutoHyphens w:val="true"/>
-              <w:spacing w:lineRule="auto" w:line="240" w:before="0" w:after="0"/>
-              <w:jc w:val="left"/>
-              <w:rPr>
-                <w:rFonts w:ascii="Helvetica Neue" w:hAnsi="Helvetica Neue" w:eastAsia="Open Sans" w:cs="Open Sans"/>
-                <w:color w:val="070707"/>
-                <w:sz w:val="18"/>
-                <w:szCs w:val="18"/>
-              </w:rPr>
-            </w:pPr>
-            <w:r>
-              <w:rPr>
-                <w:rFonts w:eastAsia="Open Sans" w:cs="Open Sans" w:ascii="Helvetica Neue" w:hAnsi="Helvetica Neue"/>
-                <w:color w:val="070707"/>
-                <w:sz w:val="18"/>
-                <w:szCs w:val="18"/>
-              </w:rPr>
-            </w:r>
-          </w:p>
-          <w:p>
-            <w:pPr>
-              <w:pStyle w:val="Normal"/>
-              <w:widowControl w:val="false"/>
-              <w:spacing w:lineRule="auto" w:line="360"/>
-              <w:jc w:val="right"/>
-              <w:rPr>
-                <w:rFonts w:ascii="Helvetica Neue" w:hAnsi="Helvetica Neue" w:cs="Arial"/>
-                <w:sz w:val="18"/>
-                <w:szCs w:val="18"/>
-              </w:rPr>
-            </w:pPr>
-            <w:r>
-              <w:rPr>
-                <w:rFonts w:cs="Arial" w:ascii="Helvetica Neue" w:hAnsi="Helvetica Neue"/>
-                <w:sz w:val="18"/>
-                <w:szCs w:val="18"/>
-              </w:rPr>
-            </w:r>
-          </w:p>
-          <w:p>
-            <w:pPr>
-              <w:pStyle w:val="Normal"/>
-              <w:widowControl w:val="false"/>
-              <w:spacing w:lineRule="auto" w:line="360"/>
-              <w:jc w:val="right"/>
-              <w:rPr>
-                <w:rFonts w:ascii="Helvetica Neue" w:hAnsi="Helvetica Neue" w:eastAsia="Arial" w:cs="Arial"/>
-                <w:sz w:val="18"/>
-                <w:szCs w:val="18"/>
-              </w:rPr>
-            </w:pPr>
-            <w:r>
-              <w:rPr>
-                <w:rFonts w:eastAsia="Arial" w:cs="Arial" w:ascii="Helvetica Neue" w:hAnsi="Helvetica Neue"/>
-                <w:sz w:val="18"/>
-                <w:szCs w:val="18"/>
-              </w:rPr>
-            </w:r>
-          </w:p>
-          <w:p>
-            <w:pPr>
-              <w:pStyle w:val="Normal"/>
-              <w:widowControl w:val="false"/>
-              <w:spacing w:lineRule="auto" w:line="360"/>
-              <w:jc w:val="right"/>
-              <w:rPr>
-                <w:rFonts w:ascii="Helvetica Neue" w:hAnsi="Helvetica Neue"/>
-                <w:sz w:val="18"/>
-                <w:szCs w:val="18"/>
-              </w:rPr>
-            </w:pPr>
-            <w:r>
-              <w:rPr>
-                <w:rFonts w:ascii="Helvetica Neue" w:hAnsi="Helvetica Neue"/>
-                <w:sz w:val="18"/>
-                <w:szCs w:val="18"/>
-              </w:rPr>
             </w:r>
           </w:p>
         </w:tc>
@@ -739,10 +597,7 @@
         <w:spacing w:lineRule="auto" w:line="276" w:before="240" w:after="0"/>
         <w:jc w:val="right"/>
         <w:rPr>
-          <w:rFonts w:ascii="Helvetica Neue" w:hAnsi="Helvetica Neue"/>
-          <w:sz w:val="18"/>
-          <w:szCs w:val="18"/>
-          <w:lang w:val="de-DE"/>
+          <w:rFonts w:ascii="Open Sans" w:hAnsi="Open Sans"/>
         </w:rPr>
       </w:pPr>
       <w:r>
@@ -861,7 +716,7 @@
       </w:r>
       <w:r>
         <w:rPr>
-          <w:rFonts w:cs="Arial" w:ascii="Helvetica Neue" w:hAnsi="Helvetica Neue"/>
+          <w:rFonts w:cs="Arial" w:ascii="Open Sans" w:hAnsi="Open Sans"/>
           <w:sz w:val="18"/>
           <w:szCs w:val="18"/>
           <w:lang w:val="de-DE"/>
@@ -880,15 +735,12 @@
         <w:ind w:hanging="0" w:left="0"/>
         <w:outlineLvl w:val="0"/>
         <w:rPr>
-          <w:rFonts w:ascii="Helvetica Neue" w:hAnsi="Helvetica Neue"/>
-          <w:sz w:val="18"/>
-          <w:szCs w:val="18"/>
-          <w:lang w:val="de-DE"/>
+          <w:rFonts w:ascii="Open Sans" w:hAnsi="Open Sans"/>
         </w:rPr>
       </w:pPr>
       <w:r>
         <w:rPr>
-          <w:rFonts w:eastAsia="Cambria" w:cs="Arial" w:ascii="Helvetica Neue" w:hAnsi="Helvetica Neue"/>
+          <w:rFonts w:eastAsia="Cambria" w:cs="Arial" w:ascii="Open Sans" w:hAnsi="Open Sans"/>
           <w:b/>
           <w:sz w:val="18"/>
           <w:szCs w:val="18"/>
@@ -901,11 +753,13 @@
       <w:pPr>
         <w:pStyle w:val="Normal"/>
         <w:spacing w:lineRule="auto" w:line="276" w:before="144" w:after="0"/>
-        <w:rPr/>
+        <w:rPr>
+          <w:rFonts w:ascii="Open Sans" w:hAnsi="Open Sans"/>
+        </w:rPr>
       </w:pPr>
       <w:r>
         <w:rPr>
-          <w:rFonts w:eastAsia="Open Sans" w:cs="Open Sans" w:ascii="Helvetica Neue" w:hAnsi="Helvetica Neue"/>
+          <w:rFonts w:eastAsia="Open Sans" w:cs="Open Sans" w:ascii="Open Sans" w:hAnsi="Open Sans"/>
           <w:color w:val="070707"/>
           <w:sz w:val="18"/>
           <w:szCs w:val="18"/>
@@ -919,14 +773,12 @@
         <w:pStyle w:val="Normal"/>
         <w:spacing w:lineRule="auto" w:line="276" w:before="58" w:after="0"/>
         <w:rPr>
-          <w:rFonts w:ascii="Helvetica Neue" w:hAnsi="Helvetica Neue"/>
-          <w:sz w:val="18"/>
-          <w:szCs w:val="18"/>
+          <w:rFonts w:ascii="Open Sans" w:hAnsi="Open Sans"/>
         </w:rPr>
       </w:pPr>
       <w:r>
         <w:rPr>
-          <w:rFonts w:eastAsia="Cambria" w:cs="Arial" w:ascii="Helvetica Neue" w:hAnsi="Helvetica Neue"/>
+          <w:rFonts w:eastAsia="Cambria" w:cs="Arial" w:ascii="Open Sans" w:hAnsi="Open Sans"/>
           <w:sz w:val="18"/>
           <w:szCs w:val="18"/>
           <w:lang w:val="de-DE" w:eastAsia="ru-RU"/>
@@ -937,7 +789,7 @@
       </w:r>
       <w:r>
         <w:rPr>
-          <w:rFonts w:eastAsia="Arial" w:cs="Arial" w:ascii="Helvetica Neue" w:hAnsi="Helvetica Neue"/>
+          <w:rFonts w:eastAsia="Arial" w:cs="Arial" w:ascii="Open Sans" w:hAnsi="Open Sans"/>
           <w:sz w:val="18"/>
           <w:szCs w:val="18"/>
           <w:lang w:val="de-DE" w:eastAsia="ru-RU"/>
@@ -949,14 +801,14 @@
       <w:pPr>
         <w:pStyle w:val="Normal"/>
         <w:rPr>
-          <w:rFonts w:ascii="Jubilat" w:hAnsi="Jubilat" w:eastAsia="Dotum" w:cs="Dotum"/>
+          <w:rFonts w:ascii="Open Sans" w:hAnsi="Open Sans" w:eastAsia="Dotum" w:cs="Dotum"/>
           <w:sz w:val="18"/>
           <w:szCs w:val="18"/>
         </w:rPr>
       </w:pPr>
       <w:r>
         <w:rPr>
-          <w:rFonts w:eastAsia="Dotum" w:cs="Dotum" w:ascii="Jubilat" w:hAnsi="Jubilat"/>
+          <w:rFonts w:eastAsia="Dotum" w:cs="Dotum" w:ascii="Open Sans" w:hAnsi="Open Sans"/>
           <w:sz w:val="18"/>
           <w:szCs w:val="18"/>
         </w:rPr>
@@ -964,7 +816,7 @@
     </w:p>
     <w:tbl>
       <w:tblPr>
-        <w:tblW w:w="9639" w:type="dxa"/>
+        <w:tblW w:w="9634" w:type="dxa"/>
         <w:jc w:val="left"/>
         <w:tblInd w:w="120" w:type="dxa"/>
         <w:tblLayout w:type="fixed"/>
@@ -977,9 +829,9 @@
         <w:tblLook w:val="04a0" w:noVBand="1" w:noHBand="0" w:lastColumn="0" w:firstColumn="1" w:lastRow="0" w:firstRow="1"/>
       </w:tblPr>
       <w:tblGrid>
-        <w:gridCol w:w="708"/>
-        <w:gridCol w:w="4391"/>
-        <w:gridCol w:w="1566"/>
+        <w:gridCol w:w="707"/>
+        <w:gridCol w:w="4389"/>
+        <w:gridCol w:w="1564"/>
         <w:gridCol w:w="1415"/>
         <w:gridCol w:w="1559"/>
       </w:tblGrid>
@@ -989,12 +841,9 @@
         </w:trPr>
         <w:tc>
           <w:tcPr>
-            <w:tcW w:w="708" w:type="dxa"/>
-            <w:tcBorders>
-              <w:top w:val="single" w:sz="2" w:space="0" w:color="000000"/>
-              <w:left w:val="single" w:sz="2" w:space="0" w:color="000000"/>
-            </w:tcBorders>
-            <w:shd w:color="auto" w:fill="EEEEEE" w:val="clear"/>
+            <w:tcW w:w="707" w:type="dxa"/>
+            <w:tcBorders/>
+            <w:shd w:fill="CCCCCC" w:val="clear"/>
             <w:vAlign w:val="center"/>
           </w:tcPr>
           <w:p>
@@ -1003,14 +852,12 @@
               <w:widowControl w:val="false"/>
               <w:spacing w:lineRule="auto" w:line="276"/>
               <w:rPr>
-                <w:rFonts w:ascii="Helvetica Neue" w:hAnsi="Helvetica Neue"/>
-                <w:sz w:val="18"/>
-                <w:szCs w:val="18"/>
+                <w:rFonts w:ascii="Open Sans" w:hAnsi="Open Sans"/>
               </w:rPr>
             </w:pPr>
             <w:r>
               <w:rPr>
-                <w:rFonts w:eastAsia="Arial" w:cs="Arial" w:ascii="Helvetica Neue" w:hAnsi="Helvetica Neue"/>
+                <w:rFonts w:eastAsia="Arial" w:cs="Arial" w:ascii="Open Sans" w:hAnsi="Open Sans"/>
                 <w:b/>
                 <w:sz w:val="18"/>
                 <w:szCs w:val="18"/>
@@ -1022,11 +869,9 @@
         </w:tc>
         <w:tc>
           <w:tcPr>
-            <w:tcW w:w="4391" w:type="dxa"/>
-            <w:tcBorders>
-              <w:top w:val="single" w:sz="2" w:space="0" w:color="000000"/>
-            </w:tcBorders>
-            <w:shd w:color="auto" w:fill="EEEEEE" w:val="clear"/>
+            <w:tcW w:w="4389" w:type="dxa"/>
+            <w:tcBorders/>
+            <w:shd w:fill="CCCCCC" w:val="clear"/>
             <w:vAlign w:val="center"/>
           </w:tcPr>
           <w:p>
@@ -1035,14 +880,12 @@
               <w:widowControl w:val="false"/>
               <w:spacing w:lineRule="auto" w:line="276"/>
               <w:rPr>
-                <w:rFonts w:ascii="Helvetica Neue" w:hAnsi="Helvetica Neue"/>
-                <w:sz w:val="18"/>
-                <w:szCs w:val="18"/>
+                <w:rFonts w:ascii="Open Sans" w:hAnsi="Open Sans"/>
               </w:rPr>
             </w:pPr>
             <w:r>
               <w:rPr>
-                <w:rFonts w:eastAsia="Arial" w:cs="Arial" w:ascii="Helvetica Neue" w:hAnsi="Helvetica Neue"/>
+                <w:rFonts w:eastAsia="Arial" w:cs="Arial" w:ascii="Open Sans" w:hAnsi="Open Sans"/>
                 <w:b/>
                 <w:sz w:val="18"/>
                 <w:szCs w:val="18"/>
@@ -1054,11 +897,9 @@
         </w:tc>
         <w:tc>
           <w:tcPr>
-            <w:tcW w:w="1566" w:type="dxa"/>
-            <w:tcBorders>
-              <w:top w:val="single" w:sz="2" w:space="0" w:color="000000"/>
-            </w:tcBorders>
-            <w:shd w:color="auto" w:fill="EEEEEE" w:val="clear"/>
+            <w:tcW w:w="1564" w:type="dxa"/>
+            <w:tcBorders/>
+            <w:shd w:fill="CCCCCC" w:val="clear"/>
             <w:vAlign w:val="center"/>
           </w:tcPr>
           <w:p>
@@ -1068,14 +909,12 @@
               <w:spacing w:lineRule="auto" w:line="276"/>
               <w:jc w:val="right"/>
               <w:rPr>
-                <w:rFonts w:ascii="Helvetica Neue" w:hAnsi="Helvetica Neue"/>
-                <w:sz w:val="18"/>
-                <w:szCs w:val="18"/>
+                <w:rFonts w:ascii="Open Sans" w:hAnsi="Open Sans"/>
               </w:rPr>
             </w:pPr>
             <w:r>
               <w:rPr>
-                <w:rFonts w:eastAsia="Arial" w:cs="Arial" w:ascii="Helvetica Neue" w:hAnsi="Helvetica Neue"/>
+                <w:rFonts w:eastAsia="Arial" w:cs="Arial" w:ascii="Open Sans" w:hAnsi="Open Sans"/>
                 <w:b/>
                 <w:sz w:val="18"/>
                 <w:szCs w:val="18"/>
@@ -1088,10 +927,8 @@
         <w:tc>
           <w:tcPr>
             <w:tcW w:w="1415" w:type="dxa"/>
-            <w:tcBorders>
-              <w:top w:val="single" w:sz="2" w:space="0" w:color="000000"/>
-            </w:tcBorders>
-            <w:shd w:color="auto" w:fill="EEEEEE" w:val="clear"/>
+            <w:tcBorders/>
+            <w:shd w:fill="CCCCCC" w:val="clear"/>
             <w:vAlign w:val="center"/>
           </w:tcPr>
           <w:p>
@@ -1101,14 +938,12 @@
               <w:spacing w:lineRule="auto" w:line="276"/>
               <w:jc w:val="right"/>
               <w:rPr>
-                <w:rFonts w:ascii="Helvetica Neue" w:hAnsi="Helvetica Neue"/>
-                <w:sz w:val="18"/>
-                <w:szCs w:val="18"/>
+                <w:rFonts w:ascii="Open Sans" w:hAnsi="Open Sans"/>
               </w:rPr>
             </w:pPr>
             <w:r>
               <w:rPr>
-                <w:rFonts w:eastAsia="Arial" w:cs="Arial" w:ascii="Helvetica Neue" w:hAnsi="Helvetica Neue"/>
+                <w:rFonts w:eastAsia="Arial" w:cs="Arial" w:ascii="Open Sans" w:hAnsi="Open Sans"/>
                 <w:b/>
                 <w:sz w:val="18"/>
                 <w:szCs w:val="18"/>
@@ -1121,11 +956,8 @@
         <w:tc>
           <w:tcPr>
             <w:tcW w:w="1559" w:type="dxa"/>
-            <w:tcBorders>
-              <w:top w:val="single" w:sz="2" w:space="0" w:color="000000"/>
-              <w:right w:val="single" w:sz="2" w:space="0" w:color="000000"/>
-            </w:tcBorders>
-            <w:shd w:color="auto" w:fill="EEEEEE" w:val="clear"/>
+            <w:tcBorders/>
+            <w:shd w:fill="CCCCCC" w:val="clear"/>
             <w:vAlign w:val="center"/>
           </w:tcPr>
           <w:p>
@@ -1135,14 +967,12 @@
               <w:spacing w:lineRule="auto" w:line="276"/>
               <w:jc w:val="right"/>
               <w:rPr>
-                <w:rFonts w:ascii="Helvetica Neue" w:hAnsi="Helvetica Neue"/>
-                <w:sz w:val="18"/>
-                <w:szCs w:val="18"/>
+                <w:rFonts w:ascii="Open Sans" w:hAnsi="Open Sans"/>
               </w:rPr>
             </w:pPr>
             <w:r>
               <w:rPr>
-                <w:rFonts w:eastAsia="Arial" w:cs="Arial" w:ascii="Helvetica Neue" w:hAnsi="Helvetica Neue"/>
+                <w:rFonts w:eastAsia="Arial" w:cs="Arial" w:ascii="Open Sans" w:hAnsi="Open Sans"/>
                 <w:b/>
                 <w:sz w:val="18"/>
                 <w:szCs w:val="18"/>
@@ -1155,41 +985,11 @@
       </w:tr>
       <w:tr>
         <w:trPr>
-          <w:trHeight w:val="187" w:hRule="atLeast"/>
+          <w:trHeight w:val="454" w:hRule="atLeast"/>
         </w:trPr>
         <w:tc>
           <w:tcPr>
-            <w:tcW w:w="708" w:type="dxa"/>
-            <w:tcBorders>
-              <w:left w:val="single" w:sz="2" w:space="0" w:color="000000"/>
-            </w:tcBorders>
-            <w:shd w:color="auto" w:fill="auto" w:val="clear"/>
-          </w:tcPr>
-          <w:p>
-            <w:pPr>
-              <w:pStyle w:val="Normal"/>
-              <w:widowControl w:val="false"/>
-              <w:spacing w:before="40" w:after="0"/>
-              <w:rPr>
-                <w:rFonts w:ascii="Helvetica Neue" w:hAnsi="Helvetica Neue" w:cs="Arial"/>
-                <w:sz w:val="18"/>
-                <w:szCs w:val="18"/>
-                <w:lang w:val="de-DE" w:eastAsia="ru-RU"/>
-              </w:rPr>
-            </w:pPr>
-            <w:r>
-              <w:rPr>
-                <w:rFonts w:cs="Arial" w:ascii="Helvetica Neue" w:hAnsi="Helvetica Neue"/>
-                <w:sz w:val="18"/>
-                <w:szCs w:val="18"/>
-                <w:lang w:val="de-DE" w:eastAsia="ru-RU"/>
-              </w:rPr>
-            </w:r>
-          </w:p>
-        </w:tc>
-        <w:tc>
-          <w:tcPr>
-            <w:tcW w:w="4391" w:type="dxa"/>
+            <w:tcW w:w="707" w:type="dxa"/>
             <w:tcBorders/>
             <w:shd w:color="auto" w:fill="auto" w:val="clear"/>
           </w:tcPr>
@@ -1197,145 +997,13 @@
             <w:pPr>
               <w:pStyle w:val="Normal"/>
               <w:widowControl w:val="false"/>
-              <w:spacing w:before="40" w:after="0"/>
               <w:rPr>
-                <w:rFonts w:ascii="Helvetica Neue" w:hAnsi="Helvetica Neue" w:cs="Arial"/>
-                <w:b/>
-                <w:bCs/>
-                <w:color w:val="000000"/>
-                <w:sz w:val="18"/>
-                <w:szCs w:val="18"/>
-                <w:lang w:val="de-DE" w:eastAsia="ru-RU"/>
+                <w:rFonts w:ascii="Open Sans" w:hAnsi="Open Sans"/>
               </w:rPr>
             </w:pPr>
             <w:r>
               <w:rPr>
-                <w:rFonts w:cs="Arial" w:ascii="Helvetica Neue" w:hAnsi="Helvetica Neue"/>
-                <w:b/>
-                <w:bCs/>
-                <w:color w:val="000000"/>
-                <w:sz w:val="18"/>
-                <w:szCs w:val="18"/>
-                <w:lang w:val="de-DE" w:eastAsia="ru-RU"/>
-              </w:rPr>
-            </w:r>
-          </w:p>
-        </w:tc>
-        <w:tc>
-          <w:tcPr>
-            <w:tcW w:w="1566" w:type="dxa"/>
-            <w:tcBorders/>
-            <w:shd w:color="auto" w:fill="auto" w:val="clear"/>
-          </w:tcPr>
-          <w:p>
-            <w:pPr>
-              <w:pStyle w:val="Normal"/>
-              <w:widowControl w:val="false"/>
-              <w:spacing w:before="40" w:after="0"/>
-              <w:jc w:val="right"/>
-              <w:rPr>
-                <w:rFonts w:ascii="Helvetica Neue" w:hAnsi="Helvetica Neue" w:cs="Arial"/>
-                <w:sz w:val="18"/>
-                <w:szCs w:val="18"/>
-                <w:lang w:val="de-DE" w:eastAsia="ru-RU"/>
-              </w:rPr>
-            </w:pPr>
-            <w:r>
-              <w:rPr>
-                <w:rFonts w:cs="Arial" w:ascii="Helvetica Neue" w:hAnsi="Helvetica Neue"/>
-                <w:sz w:val="18"/>
-                <w:szCs w:val="18"/>
-                <w:lang w:val="de-DE" w:eastAsia="ru-RU"/>
-              </w:rPr>
-            </w:r>
-          </w:p>
-        </w:tc>
-        <w:tc>
-          <w:tcPr>
-            <w:tcW w:w="1415" w:type="dxa"/>
-            <w:tcBorders/>
-            <w:shd w:color="auto" w:fill="auto" w:val="clear"/>
-          </w:tcPr>
-          <w:p>
-            <w:pPr>
-              <w:pStyle w:val="Normal"/>
-              <w:widowControl w:val="false"/>
-              <w:spacing w:before="40" w:after="0"/>
-              <w:jc w:val="right"/>
-              <w:rPr>
-                <w:rFonts w:ascii="Helvetica Neue" w:hAnsi="Helvetica Neue" w:cs="Arial"/>
-                <w:sz w:val="18"/>
-                <w:szCs w:val="18"/>
-                <w:lang w:val="de-DE" w:eastAsia="ru-RU"/>
-              </w:rPr>
-            </w:pPr>
-            <w:r>
-              <w:rPr>
-                <w:rFonts w:cs="Arial" w:ascii="Helvetica Neue" w:hAnsi="Helvetica Neue"/>
-                <w:sz w:val="18"/>
-                <w:szCs w:val="18"/>
-                <w:lang w:val="de-DE" w:eastAsia="ru-RU"/>
-              </w:rPr>
-            </w:r>
-          </w:p>
-        </w:tc>
-        <w:tc>
-          <w:tcPr>
-            <w:tcW w:w="1559" w:type="dxa"/>
-            <w:tcBorders>
-              <w:right w:val="single" w:sz="2" w:space="0" w:color="000000"/>
-            </w:tcBorders>
-            <w:shd w:color="auto" w:fill="auto" w:val="clear"/>
-          </w:tcPr>
-          <w:p>
-            <w:pPr>
-              <w:pStyle w:val="Normal"/>
-              <w:widowControl w:val="false"/>
-              <w:spacing w:before="40" w:after="0"/>
-              <w:jc w:val="right"/>
-              <w:rPr>
-                <w:rFonts w:ascii="Helvetica Neue" w:hAnsi="Helvetica Neue" w:cs="Arial"/>
-                <w:sz w:val="18"/>
-                <w:szCs w:val="18"/>
-                <w:lang w:val="de-DE" w:eastAsia="ru-RU"/>
-              </w:rPr>
-            </w:pPr>
-            <w:r>
-              <w:rPr>
-                <w:rFonts w:cs="Arial" w:ascii="Helvetica Neue" w:hAnsi="Helvetica Neue"/>
-                <w:sz w:val="18"/>
-                <w:szCs w:val="18"/>
-                <w:lang w:val="de-DE" w:eastAsia="ru-RU"/>
-              </w:rPr>
-            </w:r>
-          </w:p>
-        </w:tc>
-      </w:tr>
-      <w:tr>
-        <w:trPr>
-          <w:trHeight w:val="454" w:hRule="atLeast"/>
-        </w:trPr>
-        <w:tc>
-          <w:tcPr>
-            <w:tcW w:w="708" w:type="dxa"/>
-            <w:tcBorders>
-              <w:left w:val="single" w:sz="2" w:space="0" w:color="000000"/>
-            </w:tcBorders>
-            <w:shd w:color="auto" w:fill="auto" w:val="clear"/>
-          </w:tcPr>
-          <w:p>
-            <w:pPr>
-              <w:pStyle w:val="Normal"/>
-              <w:widowControl w:val="false"/>
-              <w:rPr>
-                <w:rFonts w:ascii="Helvetica Neue" w:hAnsi="Helvetica Neue"/>
-                <w:sz w:val="18"/>
-                <w:szCs w:val="18"/>
-              </w:rPr>
-            </w:pPr>
-            <w:r>
-              <w:rPr>
-                <w:rFonts w:cs="Arial" w:ascii="Helvetica Neue" w:hAnsi="Helvetica Neue"/>
+                <w:rFonts w:cs="Arial" w:ascii="Open Sans" w:hAnsi="Open Sans"/>
                 <w:sz w:val="18"/>
                 <w:szCs w:val="18"/>
                 <w:lang w:val="de-DE" w:eastAsia="ru-RU"/>
@@ -1346,7 +1014,7 @@
         </w:tc>
         <w:tc>
           <w:tcPr>
-            <w:tcW w:w="4391" w:type="dxa"/>
+            <w:tcW w:w="4389" w:type="dxa"/>
             <w:tcBorders/>
             <w:shd w:color="auto" w:fill="auto" w:val="clear"/>
           </w:tcPr>
@@ -1356,15 +1024,12 @@
               <w:widowControl w:val="false"/>
               <w:spacing w:lineRule="auto" w:line="276"/>
               <w:rPr>
-                <w:rFonts w:ascii="Helvetica Neue" w:hAnsi="Helvetica Neue"/>
-                <w:sz w:val="18"/>
-                <w:szCs w:val="18"/>
-                <w:lang w:val="de-DE"/>
+                <w:rFonts w:ascii="Open Sans" w:hAnsi="Open Sans"/>
               </w:rPr>
             </w:pPr>
             <w:r>
               <w:rPr>
-                <w:rFonts w:cs="Arial" w:ascii="Helvetica Neue" w:hAnsi="Helvetica Neue"/>
+                <w:rFonts w:cs="Arial" w:ascii="Open Sans" w:hAnsi="Open Sans"/>
                 <w:b/>
                 <w:bCs/>
                 <w:color w:val="000000"/>
@@ -1379,17 +1044,14 @@
             <w:pPr>
               <w:pStyle w:val="Normal"/>
               <w:widowControl w:val="false"/>
-              <w:spacing w:lineRule="auto" w:line="276"/>
+              <w:spacing w:lineRule="auto" w:line="276" w:before="0" w:after="58"/>
               <w:rPr>
-                <w:rFonts w:ascii="Helvetica Neue" w:hAnsi="Helvetica Neue"/>
-                <w:sz w:val="18"/>
-                <w:szCs w:val="18"/>
-                <w:lang w:val="de-DE"/>
+                <w:rFonts w:ascii="Open Sans" w:hAnsi="Open Sans"/>
               </w:rPr>
             </w:pPr>
             <w:r>
               <w:rPr>
-                <w:rFonts w:cs="Arial" w:ascii="Helvetica Neue" w:hAnsi="Helvetica Neue"/>
+                <w:rFonts w:cs="Arial" w:ascii="Open Sans" w:hAnsi="Open Sans"/>
                 <w:bCs/>
                 <w:color w:val="000000"/>
                 <w:sz w:val="18"/>
@@ -1398,20 +1060,11 @@
               </w:rPr>
               <w:t>Die Anfahrtspauschale enthält die Kosten für das Rüsten vor der Anfahrt, sowie die KFZ-Kosten.</w:t>
             </w:r>
-            <w:r>
-              <w:rPr>
-                <w:rFonts w:ascii="Helvetica Neue" w:hAnsi="Helvetica Neue"/>
-                <w:sz w:val="18"/>
-                <w:szCs w:val="18"/>
-                <w:lang w:val="de-DE"/>
-              </w:rPr>
-              <w:br/>
-            </w:r>
           </w:p>
         </w:tc>
         <w:tc>
           <w:tcPr>
-            <w:tcW w:w="1566" w:type="dxa"/>
+            <w:tcW w:w="1564" w:type="dxa"/>
             <w:tcBorders/>
             <w:shd w:color="auto" w:fill="auto" w:val="clear"/>
           </w:tcPr>
@@ -1421,11 +1074,13 @@
               <w:suppressAutoHyphens w:val="true"/>
               <w:spacing w:before="0" w:after="40"/>
               <w:jc w:val="right"/>
-              <w:rPr/>
+              <w:rPr>
+                <w:rFonts w:ascii="Open Sans" w:hAnsi="Open Sans"/>
+              </w:rPr>
             </w:pPr>
             <w:r>
               <w:rPr>
-                <w:rFonts w:eastAsia="Open Sans" w:cs="Open Sans" w:ascii="Helvetica Neue" w:hAnsi="Helvetica Neue"/>
+                <w:rFonts w:eastAsia="Open Sans" w:cs="Open Sans" w:ascii="Open Sans" w:hAnsi="Open Sans"/>
                 <w:color w:val="070707"/>
                 <w:kern w:val="0"/>
                 <w:sz w:val="17"/>
@@ -1448,11 +1103,13 @@
               <w:suppressAutoHyphens w:val="true"/>
               <w:spacing w:before="0" w:after="40"/>
               <w:jc w:val="right"/>
-              <w:rPr/>
+              <w:rPr>
+                <w:rFonts w:ascii="Open Sans" w:hAnsi="Open Sans"/>
+              </w:rPr>
             </w:pPr>
             <w:r>
               <w:rPr>
-                <w:rFonts w:eastAsia="Open Sans" w:cs="Open Sans" w:ascii="Helvetica Neue" w:hAnsi="Helvetica Neue"/>
+                <w:rFonts w:eastAsia="Open Sans" w:cs="Open Sans" w:ascii="Open Sans" w:hAnsi="Open Sans"/>
                 <w:color w:val="070707"/>
                 <w:kern w:val="0"/>
                 <w:sz w:val="17"/>
@@ -1466,9 +1123,7 @@
         <w:tc>
           <w:tcPr>
             <w:tcW w:w="1559" w:type="dxa"/>
-            <w:tcBorders>
-              <w:right w:val="single" w:sz="2" w:space="0" w:color="000000"/>
-            </w:tcBorders>
+            <w:tcBorders/>
             <w:shd w:color="auto" w:fill="auto" w:val="clear"/>
           </w:tcPr>
           <w:p>
@@ -1477,11 +1132,13 @@
               <w:suppressAutoHyphens w:val="true"/>
               <w:spacing w:before="0" w:after="40"/>
               <w:jc w:val="right"/>
-              <w:rPr/>
+              <w:rPr>
+                <w:rFonts w:ascii="Open Sans" w:hAnsi="Open Sans"/>
+              </w:rPr>
             </w:pPr>
             <w:r>
               <w:rPr>
-                <w:rFonts w:eastAsia="Open Sans" w:cs="Open Sans" w:ascii="Helvetica Neue" w:hAnsi="Helvetica Neue"/>
+                <w:rFonts w:eastAsia="Open Sans" w:cs="Open Sans" w:ascii="Open Sans" w:hAnsi="Open Sans"/>
                 <w:b/>
                 <w:bCs/>
                 <w:color w:val="070707"/>
@@ -1501,10 +1158,8 @@
         </w:trPr>
         <w:tc>
           <w:tcPr>
-            <w:tcW w:w="708" w:type="dxa"/>
-            <w:tcBorders>
-              <w:left w:val="single" w:sz="2" w:space="0" w:color="000000"/>
-            </w:tcBorders>
+            <w:tcW w:w="707" w:type="dxa"/>
+            <w:tcBorders/>
             <w:shd w:color="auto" w:fill="auto" w:val="clear"/>
           </w:tcPr>
           <w:p>
@@ -1514,15 +1169,12 @@
               <w:spacing w:before="0" w:after="40"/>
               <w:jc w:val="left"/>
               <w:rPr>
-                <w:rFonts w:ascii="Open Sans" w:hAnsi="Open Sans" w:eastAsia="Open Sans" w:cs="Open Sans"/>
-                <w:color w:val="070707"/>
-                <w:sz w:val="17"/>
-                <w:szCs w:val="17"/>
+                <w:rFonts w:ascii="Open Sans" w:hAnsi="Open Sans"/>
               </w:rPr>
             </w:pPr>
             <w:r>
               <w:rPr>
-                <w:rFonts w:eastAsia="Open Sans" w:cs="Open Sans" w:ascii="Helvetica Neue" w:hAnsi="Helvetica Neue"/>
+                <w:rFonts w:eastAsia="Open Sans" w:cs="Open Sans" w:ascii="Open Sans" w:hAnsi="Open Sans"/>
                 <w:color w:val="070707"/>
                 <w:kern w:val="0"/>
                 <w:sz w:val="17"/>
@@ -1535,7 +1187,7 @@
         </w:tc>
         <w:tc>
           <w:tcPr>
-            <w:tcW w:w="4391" w:type="dxa"/>
+            <w:tcW w:w="4389" w:type="dxa"/>
             <w:tcBorders/>
             <w:shd w:color="auto" w:fill="auto" w:val="clear"/>
           </w:tcPr>
@@ -1543,17 +1195,15 @@
             <w:pPr>
               <w:pStyle w:val="Normal"/>
               <w:suppressAutoHyphens w:val="true"/>
-              <w:spacing w:before="0" w:after="10"/>
+              <w:spacing w:before="0" w:after="0"/>
               <w:jc w:val="left"/>
               <w:rPr>
-                <w:rFonts w:ascii="Helvetica Neue" w:hAnsi="Helvetica Neue"/>
-                <w:sz w:val="18"/>
-                <w:szCs w:val="18"/>
+                <w:rFonts w:ascii="Open Sans" w:hAnsi="Open Sans"/>
               </w:rPr>
             </w:pPr>
             <w:r>
               <w:rPr>
-                <w:rFonts w:eastAsia="Open Sans" w:cs="Open Sans" w:ascii="Helvetica Neue" w:hAnsi="Helvetica Neue"/>
+                <w:rFonts w:eastAsia="Open Sans" w:cs="Open Sans" w:ascii="Open Sans" w:hAnsi="Open Sans"/>
                 <w:b/>
                 <w:bCs/>
                 <w:color w:val="070707"/>
@@ -1569,17 +1219,15 @@
             <w:pPr>
               <w:pStyle w:val="Normal"/>
               <w:suppressAutoHyphens w:val="true"/>
-              <w:spacing w:before="0" w:after="8"/>
+              <w:spacing w:before="0" w:after="0"/>
               <w:jc w:val="left"/>
               <w:rPr>
-                <w:rFonts w:ascii="Helvetica Neue" w:hAnsi="Helvetica Neue"/>
-                <w:sz w:val="18"/>
-                <w:szCs w:val="18"/>
+                <w:rFonts w:ascii="Open Sans" w:hAnsi="Open Sans"/>
               </w:rPr>
             </w:pPr>
             <w:r>
               <w:rPr>
-                <w:rFonts w:eastAsia="Open Sans" w:cs="Open Sans" w:ascii="Helvetica Neue" w:hAnsi="Helvetica Neue"/>
+                <w:rFonts w:eastAsia="Open Sans" w:cs="Open Sans" w:ascii="Open Sans" w:hAnsi="Open Sans"/>
                 <w:b/>
                 <w:bCs/>
                 <w:i w:val="false"/>
@@ -1597,17 +1245,15 @@
             <w:pPr>
               <w:pStyle w:val="Normal"/>
               <w:suppressAutoHyphens w:val="true"/>
-              <w:spacing w:before="0" w:after="40"/>
+              <w:spacing w:before="0" w:after="0"/>
               <w:jc w:val="left"/>
               <w:rPr>
-                <w:rFonts w:ascii="Helvetica Neue" w:hAnsi="Helvetica Neue"/>
-                <w:sz w:val="18"/>
-                <w:szCs w:val="18"/>
+                <w:rFonts w:ascii="Open Sans" w:hAnsi="Open Sans"/>
               </w:rPr>
             </w:pPr>
             <w:r>
               <w:rPr>
-                <w:rFonts w:eastAsia="Open Sans" w:cs="Open Sans" w:ascii="Helvetica Neue" w:hAnsi="Helvetica Neue"/>
+                <w:rFonts w:eastAsia="Open Sans" w:cs="Open Sans" w:ascii="Open Sans" w:hAnsi="Open Sans"/>
                 <w:color w:val="333333"/>
                 <w:kern w:val="0"/>
                 <w:sz w:val="18"/>
@@ -1621,17 +1267,15 @@
             <w:pPr>
               <w:pStyle w:val="Normal"/>
               <w:suppressAutoHyphens w:val="true"/>
-              <w:spacing w:before="0" w:after="40"/>
+              <w:spacing w:before="0" w:after="0"/>
               <w:jc w:val="left"/>
               <w:rPr>
-                <w:rFonts w:ascii="Helvetica Neue" w:hAnsi="Helvetica Neue"/>
-                <w:sz w:val="18"/>
-                <w:szCs w:val="18"/>
+                <w:rFonts w:ascii="Open Sans" w:hAnsi="Open Sans"/>
               </w:rPr>
             </w:pPr>
             <w:r>
               <w:rPr>
-                <w:rFonts w:eastAsia="Open Sans" w:cs="Open Sans" w:ascii="Helvetica Neue" w:hAnsi="Helvetica Neue"/>
+                <w:rFonts w:eastAsia="Open Sans" w:cs="Open Sans" w:ascii="Open Sans" w:hAnsi="Open Sans"/>
                 <w:color w:val="333333"/>
                 <w:kern w:val="0"/>
                 <w:sz w:val="18"/>
@@ -1642,7 +1286,7 @@
             </w:r>
             <w:r>
               <w:rPr>
-                <w:rFonts w:eastAsia="Open Sans" w:cs="Open Sans" w:ascii="Helvetica Neue" w:hAnsi="Helvetica Neue"/>
+                <w:rFonts w:eastAsia="Open Sans" w:cs="Open Sans" w:ascii="Open Sans" w:hAnsi="Open Sans"/>
                 <w:color w:val="333333"/>
                 <w:kern w:val="0"/>
                 <w:sz w:val="18"/>
@@ -1656,17 +1300,15 @@
             <w:pPr>
               <w:pStyle w:val="Normal"/>
               <w:suppressAutoHyphens w:val="true"/>
-              <w:spacing w:before="0" w:after="40"/>
+              <w:spacing w:before="0" w:after="58"/>
               <w:jc w:val="left"/>
               <w:rPr>
-                <w:rFonts w:ascii="Helvetica Neue" w:hAnsi="Helvetica Neue"/>
-                <w:sz w:val="18"/>
-                <w:szCs w:val="18"/>
+                <w:rFonts w:ascii="Open Sans" w:hAnsi="Open Sans"/>
               </w:rPr>
             </w:pPr>
             <w:r>
               <w:rPr>
-                <w:rFonts w:eastAsia="Open Sans" w:cs="Open Sans" w:ascii="Helvetica Neue" w:hAnsi="Helvetica Neue"/>
+                <w:rFonts w:eastAsia="Open Sans" w:cs="Open Sans" w:ascii="Open Sans" w:hAnsi="Open Sans"/>
                 <w:color w:val="333333"/>
                 <w:kern w:val="0"/>
                 <w:sz w:val="18"/>
@@ -1679,7 +1321,7 @@
         </w:tc>
         <w:tc>
           <w:tcPr>
-            <w:tcW w:w="1566" w:type="dxa"/>
+            <w:tcW w:w="1564" w:type="dxa"/>
             <w:tcBorders/>
             <w:shd w:color="auto" w:fill="auto" w:val="clear"/>
           </w:tcPr>
@@ -1689,11 +1331,13 @@
               <w:suppressAutoHyphens w:val="true"/>
               <w:spacing w:before="0" w:after="40"/>
               <w:jc w:val="right"/>
-              <w:rPr/>
+              <w:rPr>
+                <w:rFonts w:ascii="Open Sans" w:hAnsi="Open Sans"/>
+              </w:rPr>
             </w:pPr>
             <w:r>
               <w:rPr>
-                <w:rFonts w:eastAsia="Open Sans" w:cs="Open Sans" w:ascii="Helvetica Neue" w:hAnsi="Helvetica Neue"/>
+                <w:rFonts w:eastAsia="Open Sans" w:cs="Open Sans" w:ascii="Open Sans" w:hAnsi="Open Sans"/>
                 <w:color w:val="070707"/>
                 <w:kern w:val="0"/>
                 <w:sz w:val="17"/>
@@ -1716,11 +1360,13 @@
               <w:suppressAutoHyphens w:val="true"/>
               <w:spacing w:before="0" w:after="40"/>
               <w:jc w:val="right"/>
-              <w:rPr/>
+              <w:rPr>
+                <w:rFonts w:ascii="Open Sans" w:hAnsi="Open Sans"/>
+              </w:rPr>
             </w:pPr>
             <w:r>
               <w:rPr>
-                <w:rFonts w:eastAsia="Open Sans" w:cs="Open Sans" w:ascii="Helvetica Neue" w:hAnsi="Helvetica Neue"/>
+                <w:rFonts w:eastAsia="Open Sans" w:cs="Open Sans" w:ascii="Open Sans" w:hAnsi="Open Sans"/>
                 <w:color w:val="070707"/>
                 <w:kern w:val="0"/>
                 <w:sz w:val="17"/>
@@ -1734,9 +1380,7 @@
         <w:tc>
           <w:tcPr>
             <w:tcW w:w="1559" w:type="dxa"/>
-            <w:tcBorders>
-              <w:right w:val="single" w:sz="2" w:space="0" w:color="000000"/>
-            </w:tcBorders>
+            <w:tcBorders/>
             <w:shd w:color="auto" w:fill="auto" w:val="clear"/>
           </w:tcPr>
           <w:p>
@@ -1745,11 +1389,13 @@
               <w:suppressAutoHyphens w:val="true"/>
               <w:spacing w:before="0" w:after="40"/>
               <w:jc w:val="right"/>
-              <w:rPr/>
+              <w:rPr>
+                <w:rFonts w:ascii="Open Sans" w:hAnsi="Open Sans"/>
+              </w:rPr>
             </w:pPr>
             <w:r>
               <w:rPr>
-                <w:rFonts w:eastAsia="Open Sans" w:cs="Open Sans" w:ascii="Helvetica Neue" w:hAnsi="Helvetica Neue"/>
+                <w:rFonts w:eastAsia="Open Sans" w:cs="Open Sans" w:ascii="Open Sans" w:hAnsi="Open Sans"/>
                 <w:b/>
                 <w:bCs/>
                 <w:color w:val="070707"/>
@@ -1765,38 +1411,33 @@
       </w:tr>
       <w:tr>
         <w:trPr>
-          <w:trHeight w:val="291" w:hRule="atLeast"/>
+          <w:trHeight w:val="344" w:hRule="atLeast"/>
         </w:trPr>
         <w:tc>
           <w:tcPr>
-            <w:tcW w:w="6665" w:type="dxa"/>
+            <w:tcW w:w="6660" w:type="dxa"/>
             <w:gridSpan w:val="3"/>
             <w:tcBorders/>
-            <w:shd w:color="auto" w:fill="EEEEEE" w:val="clear"/>
+            <w:shd w:fill="CCCCCC" w:val="clear"/>
             <w:vAlign w:val="center"/>
           </w:tcPr>
           <w:p>
             <w:pPr>
               <w:pStyle w:val="Normal"/>
               <w:widowControl w:val="false"/>
-              <w:spacing w:lineRule="auto" w:line="360"/>
+              <w:spacing w:lineRule="auto" w:line="276" w:before="0" w:after="0"/>
               <w:jc w:val="right"/>
               <w:rPr>
-                <w:rFonts w:ascii="Helvetica Neue" w:hAnsi="Helvetica Neue"/>
-                <w:b/>
-                <w:bCs/>
-                <w:sz w:val="18"/>
-                <w:szCs w:val="18"/>
+                <w:rFonts w:ascii="Open Sans" w:hAnsi="Open Sans"/>
               </w:rPr>
             </w:pPr>
             <w:r>
               <w:rPr>
-                <w:rFonts w:eastAsia="Arial" w:cs="Arial" w:ascii="Helvetica Neue" w:hAnsi="Helvetica Neue"/>
+                <w:rFonts w:eastAsia="Arial" w:cs="Arial" w:ascii="Open Sans" w:hAnsi="Open Sans"/>
                 <w:b/>
-                <w:bCs/>
                 <w:sz w:val="18"/>
                 <w:szCs w:val="18"/>
-                <w:lang w:eastAsia="ru-RU"/>
+                <w:lang w:val="de-DE" w:eastAsia="ru-RU"/>
               </w:rPr>
               <w:t>Gesamtbetrag</w:t>
             </w:r>
@@ -1807,42 +1448,26 @@
             <w:tcW w:w="2974" w:type="dxa"/>
             <w:gridSpan w:val="2"/>
             <w:tcBorders/>
-            <w:shd w:color="auto" w:fill="EEEEEE" w:val="clear"/>
+            <w:shd w:fill="CCCCCC" w:val="clear"/>
             <w:vAlign w:val="center"/>
           </w:tcPr>
           <w:p>
             <w:pPr>
               <w:pStyle w:val="Normal"/>
               <w:widowControl w:val="false"/>
-              <w:spacing w:lineRule="auto" w:line="360"/>
+              <w:spacing w:lineRule="auto" w:line="276" w:before="0" w:after="0"/>
               <w:jc w:val="right"/>
               <w:rPr>
-                <w:rFonts w:cs="Arial"/>
-                <w:sz w:val="18"/>
-                <w:szCs w:val="18"/>
+                <w:rFonts w:ascii="Open Sans" w:hAnsi="Open Sans"/>
               </w:rPr>
             </w:pPr>
             <w:r>
               <w:rPr>
-                <w:rFonts w:eastAsia="Arial" w:cs="Arial" w:ascii="Helvetica Neue" w:hAnsi="Helvetica Neue"/>
+                <w:rFonts w:eastAsia="Arial" w:cs="Arial" w:ascii="Open Sans" w:hAnsi="Open Sans"/>
                 <w:b/>
-                <w:bCs/>
                 <w:sz w:val="18"/>
                 <w:szCs w:val="18"/>
-                <w:lang w:eastAsia="ru-RU"/>
-              </w:rPr>
-              <w:t xml:space="preserve"> </w:t>
-            </w:r>
-            <w:r>
-              <w:rPr>
-                <w:rFonts w:eastAsia="Open Sans" w:cs="Open Sans" w:ascii="Helvetica Neue" w:hAnsi="Helvetica Neue"/>
-                <w:b/>
-                <w:bCs/>
-                <w:color w:val="070707"/>
-                <w:kern w:val="0"/>
-                <w:sz w:val="18"/>
-                <w:szCs w:val="18"/>
-                <w:lang w:val="pl-PL" w:eastAsia="en-US" w:bidi="ar-SA"/>
+                <w:lang w:val="de-DE" w:eastAsia="ru-RU"/>
               </w:rPr>
               <w:t>{AhGesamtbetrag}</w:t>
             </w:r>
@@ -1851,33 +1476,137 @@
       </w:tr>
       <w:tr>
         <w:trPr>
-          <w:trHeight w:val="291" w:hRule="atLeast"/>
+          <w:trHeight w:val="344" w:hRule="atLeast"/>
         </w:trPr>
         <w:tc>
           <w:tcPr>
-            <w:tcW w:w="6665" w:type="dxa"/>
+            <w:tcW w:w="6660" w:type="dxa"/>
             <w:gridSpan w:val="3"/>
             <w:tcBorders/>
-            <w:shd w:color="auto" w:fill="EEEEEE" w:val="clear"/>
+            <w:shd w:fill="FFFFFF" w:val="clear"/>
             <w:vAlign w:val="center"/>
           </w:tcPr>
           <w:p>
             <w:pPr>
               <w:pStyle w:val="Normal"/>
               <w:suppressAutoHyphens w:val="true"/>
-              <w:spacing w:before="0" w:after="60"/>
+              <w:spacing w:before="0" w:after="0"/>
               <w:jc w:val="right"/>
               <w:rPr>
-                <w:rFonts w:ascii="Helvetica Neue" w:hAnsi="Helvetica Neue"/>
-                <w:b/>
-                <w:bCs/>
-                <w:sz w:val="18"/>
-                <w:szCs w:val="18"/>
+                <w:b w:val="false"/>
+                <w:bCs w:val="false"/>
               </w:rPr>
             </w:pPr>
             <w:r>
               <w:rPr>
-                <w:rFonts w:eastAsia="Open Sans" w:cs="Open Sans" w:ascii="Helvetica Neue" w:hAnsi="Helvetica Neue"/>
+                <w:rFonts w:eastAsia="Open Sans" w:cs="Open Sans" w:ascii="Open Sans" w:hAnsi="Open Sans"/>
+                <w:b w:val="false"/>
+                <w:bCs w:val="false"/>
+                <w:i w:val="false"/>
+                <w:caps w:val="false"/>
+                <w:smallCaps w:val="false"/>
+                <w:color w:val="000000"/>
+                <w:spacing w:val="0"/>
+                <w:sz w:val="18"/>
+                <w:szCs w:val="18"/>
+                <w:lang w:val="de-DE" w:eastAsia="ru-RU"/>
+              </w:rPr>
+              <w:t>{#AhHasEigenanteil}</w:t>
+            </w:r>
+            <w:r>
+              <w:rPr>
+                <w:rFonts w:ascii="Open Sans" w:hAnsi="Open Sans"/>
+                <w:b w:val="false"/>
+                <w:bCs w:val="false"/>
+                <w:i w:val="false"/>
+                <w:caps w:val="false"/>
+                <w:smallCaps w:val="false"/>
+                <w:color w:val="000000"/>
+                <w:spacing w:val="0"/>
+                <w:sz w:val="18"/>
+                <w:szCs w:val="18"/>
+              </w:rPr>
+              <w:t>abzgl. Entlastungsbetrag § 45b SGB XI</w:t>
+            </w:r>
+          </w:p>
+        </w:tc>
+        <w:tc>
+          <w:tcPr>
+            <w:tcW w:w="2974" w:type="dxa"/>
+            <w:gridSpan w:val="2"/>
+            <w:tcBorders/>
+            <w:shd w:fill="FFFFFF" w:val="clear"/>
+            <w:vAlign w:val="center"/>
+          </w:tcPr>
+          <w:p>
+            <w:pPr>
+              <w:pStyle w:val="Normal"/>
+              <w:suppressAutoHyphens w:val="true"/>
+              <w:spacing w:before="0" w:after="0"/>
+              <w:jc w:val="right"/>
+              <w:rPr>
+                <w:b w:val="false"/>
+                <w:bCs w:val="false"/>
+              </w:rPr>
+            </w:pPr>
+            <w:r>
+              <w:rPr>
+                <w:rFonts w:ascii="Open Sans" w:hAnsi="Open Sans"/>
+                <w:b w:val="false"/>
+                <w:bCs w:val="false"/>
+                <w:i w:val="false"/>
+                <w:caps w:val="false"/>
+                <w:smallCaps w:val="false"/>
+                <w:color w:val="000000"/>
+                <w:spacing w:val="0"/>
+                <w:sz w:val="18"/>
+                <w:szCs w:val="18"/>
+              </w:rPr>
+              <w:t>–</w:t>
+            </w:r>
+            <w:r>
+              <w:rPr>
+                <w:rFonts w:ascii="Open Sans" w:hAnsi="Open Sans"/>
+                <w:b w:val="false"/>
+                <w:bCs w:val="false"/>
+                <w:i w:val="false"/>
+                <w:caps w:val="false"/>
+                <w:smallCaps w:val="false"/>
+                <w:color w:val="000000"/>
+                <w:spacing w:val="0"/>
+                <w:sz w:val="18"/>
+                <w:szCs w:val="18"/>
+              </w:rPr>
+              <w:t>{AhEntlastungsbetrag}</w:t>
+            </w:r>
+          </w:p>
+        </w:tc>
+      </w:tr>
+      <w:tr>
+        <w:trPr>
+          <w:trHeight w:val="344" w:hRule="atLeast"/>
+        </w:trPr>
+        <w:tc>
+          <w:tcPr>
+            <w:tcW w:w="6660" w:type="dxa"/>
+            <w:gridSpan w:val="3"/>
+            <w:tcBorders/>
+            <w:shd w:fill="CCCCCC" w:val="clear"/>
+            <w:vAlign w:val="center"/>
+          </w:tcPr>
+          <w:p>
+            <w:pPr>
+              <w:pStyle w:val="Normal"/>
+              <w:suppressAutoHyphens w:val="true"/>
+              <w:spacing w:before="0" w:after="0"/>
+              <w:jc w:val="right"/>
+              <w:rPr>
+                <w:rFonts w:ascii="Open Sans" w:hAnsi="Open Sans"/>
+              </w:rPr>
+            </w:pPr>
+            <w:r>
+              <w:rPr>
+                <w:rFonts w:eastAsia="Open Sans" w:cs="Open Sans" w:ascii="Open Sans" w:hAnsi="Open Sans"/>
                 <w:b/>
                 <w:bCs/>
                 <w:i w:val="false"/>
@@ -1887,8 +1616,9 @@
                 <w:spacing w:val="0"/>
                 <w:sz w:val="18"/>
                 <w:szCs w:val="18"/>
+                <w:lang w:val="de-DE" w:eastAsia="ru-RU"/>
               </w:rPr>
-              <w:t>{#AhHasEigenanteil}Ihr Eigenanteil nach Entlastungsbetrag § 45b</w:t>
+              <w:t>Ihr Eigenanteil</w:t>
             </w:r>
           </w:p>
         </w:tc>
@@ -1897,24 +1627,22 @@
             <w:tcW w:w="2974" w:type="dxa"/>
             <w:gridSpan w:val="2"/>
             <w:tcBorders/>
-            <w:shd w:color="auto" w:fill="EEEEEE" w:val="clear"/>
+            <w:shd w:fill="CCCCCC" w:val="clear"/>
             <w:vAlign w:val="center"/>
           </w:tcPr>
           <w:p>
             <w:pPr>
               <w:pStyle w:val="Normal"/>
               <w:suppressAutoHyphens w:val="true"/>
-              <w:spacing w:before="0" w:after="60"/>
+              <w:spacing w:before="0" w:after="0"/>
               <w:jc w:val="right"/>
               <w:rPr>
-                <w:rFonts w:ascii="Helvetica Neue" w:hAnsi="Helvetica Neue"/>
-                <w:sz w:val="18"/>
-                <w:szCs w:val="18"/>
+                <w:rFonts w:ascii="Open Sans" w:hAnsi="Open Sans"/>
               </w:rPr>
             </w:pPr>
             <w:r>
               <w:rPr>
-                <w:rFonts w:ascii="Helvetica Neue" w:hAnsi="Helvetica Neue"/>
+                <w:rFonts w:eastAsia="Arial" w:cs="Arial" w:ascii="Open Sans" w:hAnsi="Open Sans"/>
                 <w:b/>
                 <w:bCs/>
                 <w:kern w:val="0"/>
@@ -1926,7 +1654,7 @@
             </w:r>
             <w:r>
               <w:rPr>
-                <w:rFonts w:eastAsia="Open Sans" w:cs="Open Sans" w:ascii="Helvetica Neue" w:hAnsi="Helvetica Neue"/>
+                <w:rFonts w:eastAsia="Open Sans" w:cs="Open Sans" w:ascii="Open Sans" w:hAnsi="Open Sans"/>
                 <w:b/>
                 <w:bCs/>
                 <w:i w:val="false"/>
@@ -1970,12 +1698,7 @@
         <w:pStyle w:val="Normal"/>
         <w:spacing w:before="0" w:after="40"/>
         <w:rPr>
-          <w:rFonts w:ascii="Helvetica Neue" w:hAnsi="Helvetica Neue" w:eastAsia="Open Sans" w:cs="Open Sans"/>
-          <w:i/>
-          <w:i/>
-          <w:color w:val="444444"/>
-          <w:sz w:val="18"/>
-          <w:szCs w:val="18"/>
+          <w:rFonts w:ascii="Open Sans" w:hAnsi="Open Sans"/>
         </w:rPr>
       </w:pPr>
       <w:r>
@@ -2094,7 +1817,7 @@
       </w:r>
       <w:r>
         <w:rPr>
-          <w:rFonts w:eastAsia="Open Sans" w:cs="Open Sans" w:ascii="Helvetica Neue" w:hAnsi="Helvetica Neue"/>
+          <w:rFonts w:eastAsia="Open Sans" w:cs="Open Sans" w:ascii="Open Sans" w:hAnsi="Open Sans"/>
           <w:i/>
           <w:color w:val="444444"/>
           <w:sz w:val="18"/>
@@ -2111,7 +1834,7 @@
         <w:pStyle w:val="Normal"/>
         <w:spacing w:before="0" w:after="40"/>
         <w:rPr>
-          <w:rFonts w:ascii="Helvetica Neue" w:hAnsi="Helvetica Neue" w:eastAsia="Open Sans" w:cs="Open Sans"/>
+          <w:rFonts w:ascii="Open Sans" w:hAnsi="Open Sans" w:eastAsia="Open Sans" w:cs="Open Sans"/>
           <w:i/>
           <w:i/>
           <w:color w:val="444444"/>
@@ -2121,7 +1844,7 @@
       </w:pPr>
       <w:r>
         <w:rPr>
-          <w:rFonts w:eastAsia="Open Sans" w:cs="Open Sans" w:ascii="Helvetica Neue" w:hAnsi="Helvetica Neue"/>
+          <w:rFonts w:eastAsia="Open Sans" w:cs="Open Sans" w:ascii="Open Sans" w:hAnsi="Open Sans"/>
           <w:i/>
           <w:color w:val="444444"/>
           <w:sz w:val="18"/>
@@ -2139,17 +1862,12 @@
         </w:tabs>
         <w:spacing w:lineRule="auto" w:line="240" w:before="0" w:after="0"/>
         <w:rPr>
-          <w:rFonts w:ascii="Helvetica Neue" w:hAnsi="Helvetica Neue"/>
-          <w:b w:val="false"/>
-          <w:bCs w:val="false"/>
-          <w:sz w:val="18"/>
-          <w:szCs w:val="18"/>
-          <w:lang w:val="de-DE" w:eastAsia="ru-RU"/>
+          <w:rFonts w:ascii="Open Sans" w:hAnsi="Open Sans"/>
         </w:rPr>
       </w:pPr>
       <w:r>
         <w:rPr>
-          <w:rFonts w:ascii="Helvetica Neue" w:hAnsi="Helvetica Neue"/>
+          <w:rFonts w:ascii="Open Sans" w:hAnsi="Open Sans"/>
           <w:b w:val="false"/>
           <w:bCs w:val="false"/>
           <w:sz w:val="18"/>
@@ -2159,78 +1877,128 @@
         <w:t>{#AhHasHnD}</w:t>
       </w:r>
     </w:p>
-    <w:p>
-      <w:pPr>
-        <w:pStyle w:val="Normal"/>
-        <w:widowControl w:val="false"/>
-        <w:tabs>
-          <w:tab w:val="clear" w:pos="709"/>
-          <w:tab w:val="left" w:pos="2827" w:leader="none"/>
-        </w:tabs>
-        <w:spacing w:before="57" w:after="57"/>
-        <w:rPr>
-          <w:rFonts w:ascii="Helvetica Neue" w:hAnsi="Helvetica Neue"/>
-          <w:sz w:val="18"/>
-          <w:szCs w:val="18"/>
-        </w:rPr>
-      </w:pPr>
-      <w:r>
-        <w:rPr>
-          <w:rFonts w:ascii="Helvetica Neue" w:hAnsi="Helvetica Neue"/>
-          <w:b/>
-          <w:bCs/>
-          <w:sz w:val="18"/>
-          <w:szCs w:val="18"/>
-          <w:lang w:val="de-DE" w:eastAsia="ru-RU"/>
-        </w:rPr>
-        <w:t>Konditionen – Haushaltsnahe Dienstleistungen</w:t>
-      </w:r>
-    </w:p>
     <w:tbl>
       <w:tblPr>
-        <w:tblW w:w="9633" w:type="dxa"/>
+        <w:tblW w:w="9638" w:type="dxa"/>
         <w:jc w:val="left"/>
-        <w:tblInd w:w="0" w:type="dxa"/>
+        <w:tblInd w:w="5" w:type="dxa"/>
         <w:tblLayout w:type="fixed"/>
         <w:tblCellMar>
           <w:top w:w="0" w:type="dxa"/>
-          <w:left w:w="0" w:type="dxa"/>
+          <w:left w:w="5" w:type="dxa"/>
           <w:bottom w:w="0" w:type="dxa"/>
           <w:right w:w="0" w:type="dxa"/>
         </w:tblCellMar>
         <w:tblLook w:val="04a0" w:noVBand="1" w:noHBand="0" w:lastColumn="0" w:firstColumn="1" w:lastRow="0" w:firstRow="1"/>
       </w:tblPr>
       <w:tblGrid>
-        <w:gridCol w:w="6229"/>
-        <w:gridCol w:w="3403"/>
+        <w:gridCol w:w="6232"/>
+        <w:gridCol w:w="3405"/>
       </w:tblGrid>
       <w:tr>
         <w:trPr>
-          <w:trHeight w:val="265" w:hRule="atLeast"/>
+          <w:trHeight w:val="274" w:hRule="atLeast"/>
         </w:trPr>
         <w:tc>
           <w:tcPr>
-            <w:tcW w:w="6229" w:type="dxa"/>
+            <w:tcW w:w="6232" w:type="dxa"/>
             <w:tcBorders>
               <w:top w:val="single" w:sz="4" w:space="0" w:color="000000"/>
               <w:left w:val="single" w:sz="4" w:space="0" w:color="000000"/>
               <w:bottom w:val="single" w:sz="4" w:space="0" w:color="000000"/>
             </w:tcBorders>
+            <w:shd w:fill="CCCCCC" w:val="clear"/>
+            <w:vAlign w:val="center"/>
           </w:tcPr>
           <w:p>
             <w:pPr>
               <w:pStyle w:val="Normal"/>
               <w:widowControl w:val="false"/>
-              <w:spacing w:lineRule="auto" w:line="360"/>
+              <w:tabs>
+                <w:tab w:val="clear" w:pos="709"/>
+                <w:tab w:val="left" w:pos="2827" w:leader="none"/>
+              </w:tabs>
+              <w:suppressAutoHyphens w:val="false"/>
+              <w:bidi w:val="0"/>
+              <w:spacing w:before="58" w:after="0"/>
+              <w:ind w:hanging="0" w:left="58" w:right="0"/>
+              <w:jc w:val="left"/>
               <w:rPr>
-                <w:rFonts w:ascii="Helvetica Neue" w:hAnsi="Helvetica Neue"/>
-                <w:sz w:val="18"/>
-                <w:szCs w:val="18"/>
+                <w:rFonts w:ascii="Open Sans" w:hAnsi="Open Sans"/>
               </w:rPr>
             </w:pPr>
             <w:r>
               <w:rPr>
-                <w:rFonts w:ascii="Helvetica Neue" w:hAnsi="Helvetica Neue"/>
+                <w:rFonts w:ascii="Open Sans" w:hAnsi="Open Sans"/>
+                <w:b/>
+                <w:bCs/>
+                <w:sz w:val="18"/>
+                <w:szCs w:val="18"/>
+                <w:lang w:val="de-DE" w:eastAsia="ru-RU"/>
+              </w:rPr>
+              <w:t>Konditionen – Haushaltsnahe Dienstleistungen</w:t>
+            </w:r>
+          </w:p>
+        </w:tc>
+        <w:tc>
+          <w:tcPr>
+            <w:tcW w:w="3405" w:type="dxa"/>
+            <w:tcBorders>
+              <w:top w:val="single" w:sz="4" w:space="0" w:color="000000"/>
+              <w:left w:val="single" w:sz="4" w:space="0" w:color="000000"/>
+              <w:bottom w:val="single" w:sz="4" w:space="0" w:color="000000"/>
+              <w:right w:val="single" w:sz="4" w:space="0" w:color="000000"/>
+            </w:tcBorders>
+            <w:shd w:fill="CCCCCC" w:val="clear"/>
+            <w:vAlign w:val="center"/>
+          </w:tcPr>
+          <w:p>
+            <w:pPr>
+              <w:pStyle w:val="Normal"/>
+              <w:suppressAutoHyphens w:val="false"/>
+              <w:bidi w:val="0"/>
+              <w:spacing w:before="58" w:after="0"/>
+              <w:ind w:hanging="0" w:left="58" w:right="0"/>
+              <w:jc w:val="left"/>
+              <w:rPr>
+                <w:rFonts w:ascii="Open Sans" w:hAnsi="Open Sans"/>
+              </w:rPr>
+            </w:pPr>
+            <w:r>
+              <w:rPr>
+                <w:rFonts w:ascii="Open Sans" w:hAnsi="Open Sans"/>
+              </w:rPr>
+            </w:r>
+          </w:p>
+        </w:tc>
+      </w:tr>
+      <w:tr>
+        <w:trPr/>
+        <w:tc>
+          <w:tcPr>
+            <w:tcW w:w="6232" w:type="dxa"/>
+            <w:tcBorders>
+              <w:left w:val="single" w:sz="4" w:space="0" w:color="000000"/>
+              <w:bottom w:val="single" w:sz="4" w:space="0" w:color="000000"/>
+            </w:tcBorders>
+            <w:vAlign w:val="center"/>
+          </w:tcPr>
+          <w:p>
+            <w:pPr>
+              <w:pStyle w:val="Normal"/>
+              <w:widowControl/>
+              <w:suppressAutoHyphens w:val="false"/>
+              <w:bidi w:val="0"/>
+              <w:spacing w:before="86" w:after="86"/>
+              <w:ind w:hanging="0" w:left="86" w:right="0"/>
+              <w:jc w:val="left"/>
+              <w:rPr>
+                <w:rFonts w:ascii="Open Sans" w:hAnsi="Open Sans"/>
+              </w:rPr>
+            </w:pPr>
+            <w:r>
+              <w:rPr>
+                <w:rFonts w:ascii="Open Sans" w:hAnsi="Open Sans"/>
                 <w:sz w:val="18"/>
                 <w:szCs w:val="18"/>
                 <w:lang w:val="de-DE" w:eastAsia="ru-RU"/>
@@ -2241,26 +2009,30 @@
         </w:tc>
         <w:tc>
           <w:tcPr>
-            <w:tcW w:w="3403" w:type="dxa"/>
+            <w:tcW w:w="3405" w:type="dxa"/>
             <w:tcBorders>
-              <w:top w:val="single" w:sz="4" w:space="0" w:color="000000"/>
               <w:left w:val="single" w:sz="4" w:space="0" w:color="000000"/>
               <w:bottom w:val="single" w:sz="4" w:space="0" w:color="000000"/>
               <w:right w:val="single" w:sz="4" w:space="0" w:color="000000"/>
             </w:tcBorders>
+            <w:vAlign w:val="center"/>
           </w:tcPr>
           <w:p>
             <w:pPr>
               <w:pStyle w:val="Normal"/>
+              <w:widowControl/>
+              <w:suppressAutoHyphens w:val="false"/>
+              <w:bidi w:val="0"/>
+              <w:spacing w:before="86" w:after="86"/>
+              <w:ind w:hanging="0" w:left="86" w:right="0"/>
+              <w:jc w:val="left"/>
               <w:rPr>
-                <w:rFonts w:ascii="Helvetica Neue" w:hAnsi="Helvetica Neue"/>
-                <w:sz w:val="18"/>
-                <w:szCs w:val="18"/>
+                <w:rFonts w:ascii="Open Sans" w:hAnsi="Open Sans"/>
               </w:rPr>
             </w:pPr>
             <w:r>
               <w:rPr>
-                <w:rFonts w:ascii="Helvetica Neue" w:hAnsi="Helvetica Neue"/>
+                <w:rFonts w:ascii="Open Sans" w:hAnsi="Open Sans"/>
                 <w:sz w:val="18"/>
                 <w:szCs w:val="18"/>
               </w:rPr>
@@ -2280,7 +2052,7 @@
         </w:tabs>
         <w:spacing w:before="0" w:after="0"/>
         <w:rPr>
-          <w:rFonts w:ascii="Helvetica Neue" w:hAnsi="Helvetica Neue"/>
+          <w:rFonts w:ascii="Open Sans" w:hAnsi="Open Sans"/>
           <w:b w:val="false"/>
           <w:bCs w:val="false"/>
           <w:sz w:val="18"/>
@@ -2290,7 +2062,7 @@
       </w:pPr>
       <w:r>
         <w:rPr>
-          <w:rFonts w:ascii="Helvetica Neue" w:hAnsi="Helvetica Neue"/>
+          <w:rFonts w:ascii="Open Sans" w:hAnsi="Open Sans"/>
           <w:b w:val="false"/>
           <w:bCs w:val="false"/>
           <w:sz w:val="18"/>
@@ -2310,7 +2082,7 @@
         </w:tabs>
         <w:spacing w:before="0" w:after="0"/>
         <w:rPr>
-          <w:rFonts w:ascii="Helvetica Neue" w:hAnsi="Helvetica Neue"/>
+          <w:rFonts w:ascii="Open Sans" w:hAnsi="Open Sans"/>
           <w:b w:val="false"/>
           <w:bCs w:val="false"/>
           <w:sz w:val="18"/>
@@ -2320,14 +2092,13 @@
       </w:pPr>
       <w:r>
         <w:rPr>
-          <w:rFonts w:ascii="Helvetica Neue" w:hAnsi="Helvetica Neue"/>
+          <w:rFonts w:ascii="Open Sans" w:hAnsi="Open Sans"/>
           <w:b w:val="false"/>
           <w:bCs w:val="false"/>
           <w:sz w:val="18"/>
           <w:szCs w:val="18"/>
           <w:lang w:val="de-DE" w:eastAsia="ru-RU"/>
         </w:rPr>
-        <w:t>{#AhHasAb}</w:t>
       </w:r>
     </w:p>
     <w:p>
@@ -2338,68 +2109,150 @@
           <w:tab w:val="clear" w:pos="709"/>
           <w:tab w:val="left" w:pos="2827" w:leader="none"/>
         </w:tabs>
-        <w:spacing w:before="57" w:after="57"/>
+        <w:spacing w:before="0" w:after="0"/>
         <w:rPr>
-          <w:rFonts w:ascii="Helvetica Neue" w:hAnsi="Helvetica Neue"/>
+          <w:rFonts w:ascii="Open Sans" w:hAnsi="Open Sans"/>
+          <w:b w:val="false"/>
+          <w:bCs w:val="false"/>
           <w:sz w:val="18"/>
           <w:szCs w:val="18"/>
+          <w:lang w:val="de-DE" w:eastAsia="ru-RU"/>
         </w:rPr>
       </w:pPr>
       <w:r>
         <w:rPr>
-          <w:rFonts w:ascii="Helvetica Neue" w:hAnsi="Helvetica Neue"/>
-          <w:b/>
-          <w:bCs/>
+          <w:rFonts w:ascii="Open Sans" w:hAnsi="Open Sans"/>
+          <w:b w:val="false"/>
+          <w:bCs w:val="false"/>
           <w:sz w:val="18"/>
           <w:szCs w:val="18"/>
           <w:lang w:val="de-DE" w:eastAsia="ru-RU"/>
         </w:rPr>
-        <w:t>Konditionen – Alltagsbegleitung</w:t>
+        <w:t>{#AhHasAb}</w:t>
       </w:r>
     </w:p>
     <w:tbl>
       <w:tblPr>
-        <w:tblW w:w="9634" w:type="dxa"/>
+        <w:tblW w:w="9638" w:type="dxa"/>
         <w:jc w:val="left"/>
-        <w:tblInd w:w="0" w:type="dxa"/>
+        <w:tblInd w:w="5" w:type="dxa"/>
         <w:tblLayout w:type="fixed"/>
         <w:tblCellMar>
           <w:top w:w="0" w:type="dxa"/>
-          <w:left w:w="0" w:type="dxa"/>
+          <w:left w:w="5" w:type="dxa"/>
           <w:bottom w:w="0" w:type="dxa"/>
           <w:right w:w="0" w:type="dxa"/>
         </w:tblCellMar>
         <w:tblLook w:val="04a0" w:noVBand="1" w:noHBand="0" w:lastColumn="0" w:firstColumn="1" w:lastRow="0" w:firstRow="1"/>
       </w:tblPr>
       <w:tblGrid>
-        <w:gridCol w:w="6307"/>
-        <w:gridCol w:w="3325"/>
+        <w:gridCol w:w="6232"/>
+        <w:gridCol w:w="3405"/>
       </w:tblGrid>
       <w:tr>
-        <w:trPr/>
+        <w:trPr>
+          <w:trHeight w:val="274" w:hRule="atLeast"/>
+        </w:trPr>
         <w:tc>
           <w:tcPr>
-            <w:tcW w:w="6307" w:type="dxa"/>
+            <w:tcW w:w="6232" w:type="dxa"/>
             <w:tcBorders>
               <w:top w:val="single" w:sz="4" w:space="0" w:color="000000"/>
               <w:left w:val="single" w:sz="4" w:space="0" w:color="000000"/>
               <w:bottom w:val="single" w:sz="4" w:space="0" w:color="000000"/>
             </w:tcBorders>
+            <w:shd w:fill="CCCCCC" w:val="clear"/>
+            <w:vAlign w:val="center"/>
           </w:tcPr>
           <w:p>
             <w:pPr>
               <w:pStyle w:val="Normal"/>
               <w:widowControl w:val="false"/>
-              <w:spacing w:lineRule="auto" w:line="360"/>
+              <w:tabs>
+                <w:tab w:val="clear" w:pos="709"/>
+                <w:tab w:val="left" w:pos="2827" w:leader="none"/>
+              </w:tabs>
+              <w:suppressAutoHyphens w:val="false"/>
+              <w:bidi w:val="0"/>
+              <w:spacing w:before="58" w:after="0"/>
+              <w:ind w:hanging="0" w:left="58" w:right="0"/>
+              <w:jc w:val="left"/>
               <w:rPr>
-                <w:rFonts w:ascii="Helvetica Neue" w:hAnsi="Helvetica Neue"/>
-                <w:sz w:val="18"/>
-                <w:szCs w:val="18"/>
+                <w:rFonts w:ascii="Open Sans" w:hAnsi="Open Sans"/>
               </w:rPr>
             </w:pPr>
             <w:r>
               <w:rPr>
-                <w:rFonts w:ascii="Helvetica Neue" w:hAnsi="Helvetica Neue"/>
+                <w:rFonts w:ascii="Open Sans" w:hAnsi="Open Sans"/>
+                <w:b/>
+                <w:bCs/>
+                <w:sz w:val="18"/>
+                <w:szCs w:val="18"/>
+                <w:lang w:val="de-DE" w:eastAsia="ru-RU"/>
+              </w:rPr>
+              <w:t>Konditionen – Alltagsbegleitung</w:t>
+            </w:r>
+          </w:p>
+        </w:tc>
+        <w:tc>
+          <w:tcPr>
+            <w:tcW w:w="3405" w:type="dxa"/>
+            <w:tcBorders>
+              <w:top w:val="single" w:sz="4" w:space="0" w:color="000000"/>
+              <w:left w:val="single" w:sz="4" w:space="0" w:color="000000"/>
+              <w:bottom w:val="single" w:sz="4" w:space="0" w:color="000000"/>
+              <w:right w:val="single" w:sz="4" w:space="0" w:color="000000"/>
+            </w:tcBorders>
+            <w:shd w:fill="CCCCCC" w:val="clear"/>
+            <w:vAlign w:val="center"/>
+          </w:tcPr>
+          <w:p>
+            <w:pPr>
+              <w:pStyle w:val="Normal"/>
+              <w:suppressAutoHyphens w:val="false"/>
+              <w:bidi w:val="0"/>
+              <w:spacing w:before="58" w:after="0"/>
+              <w:ind w:hanging="0" w:left="58" w:right="0"/>
+              <w:jc w:val="left"/>
+              <w:rPr>
+                <w:rFonts w:ascii="Open Sans" w:hAnsi="Open Sans"/>
+              </w:rPr>
+            </w:pPr>
+            <w:r>
+              <w:rPr>
+                <w:rFonts w:ascii="Open Sans" w:hAnsi="Open Sans"/>
+              </w:rPr>
+            </w:r>
+          </w:p>
+        </w:tc>
+      </w:tr>
+      <w:tr>
+        <w:trPr/>
+        <w:tc>
+          <w:tcPr>
+            <w:tcW w:w="6232" w:type="dxa"/>
+            <w:tcBorders>
+              <w:left w:val="single" w:sz="4" w:space="0" w:color="000000"/>
+              <w:bottom w:val="single" w:sz="4" w:space="0" w:color="000000"/>
+            </w:tcBorders>
+            <w:vAlign w:val="center"/>
+          </w:tcPr>
+          <w:p>
+            <w:pPr>
+              <w:pStyle w:val="Normal"/>
+              <w:widowControl/>
+              <w:suppressAutoHyphens w:val="false"/>
+              <w:bidi w:val="0"/>
+              <w:spacing w:before="86" w:after="86"/>
+              <w:ind w:hanging="0" w:left="86" w:right="0"/>
+              <w:jc w:val="left"/>
+              <w:rPr>
+                <w:rFonts w:ascii="Open Sans" w:hAnsi="Open Sans"/>
+              </w:rPr>
+            </w:pPr>
+            <w:r>
+              <w:rPr>
+                <w:rFonts w:ascii="Open Sans" w:hAnsi="Open Sans"/>
                 <w:sz w:val="18"/>
                 <w:szCs w:val="18"/>
                 <w:lang w:val="de-DE" w:eastAsia="ru-RU"/>
@@ -2410,28 +2263,30 @@
         </w:tc>
         <w:tc>
           <w:tcPr>
-            <w:tcW w:w="3325" w:type="dxa"/>
+            <w:tcW w:w="3405" w:type="dxa"/>
             <w:tcBorders>
-              <w:top w:val="single" w:sz="4" w:space="0" w:color="000000"/>
               <w:left w:val="single" w:sz="4" w:space="0" w:color="000000"/>
               <w:bottom w:val="single" w:sz="4" w:space="0" w:color="000000"/>
               <w:right w:val="single" w:sz="4" w:space="0" w:color="000000"/>
             </w:tcBorders>
+            <w:vAlign w:val="center"/>
           </w:tcPr>
           <w:p>
             <w:pPr>
               <w:pStyle w:val="Normal"/>
-              <w:widowControl w:val="false"/>
-              <w:spacing w:lineRule="auto" w:line="360"/>
+              <w:widowControl/>
+              <w:suppressAutoHyphens w:val="false"/>
+              <w:bidi w:val="0"/>
+              <w:spacing w:before="86" w:after="86"/>
+              <w:ind w:hanging="0" w:left="86" w:right="0"/>
+              <w:jc w:val="left"/>
               <w:rPr>
-                <w:rFonts w:ascii="Helvetica Neue" w:hAnsi="Helvetica Neue"/>
-                <w:sz w:val="18"/>
-                <w:szCs w:val="18"/>
+                <w:rFonts w:ascii="Open Sans" w:hAnsi="Open Sans"/>
               </w:rPr>
             </w:pPr>
             <w:r>
               <w:rPr>
-                <w:rFonts w:ascii="Helvetica Neue" w:hAnsi="Helvetica Neue"/>
+                <w:rFonts w:ascii="Open Sans" w:hAnsi="Open Sans"/>
                 <w:sz w:val="18"/>
                 <w:szCs w:val="18"/>
                 <w:lang w:val="de-DE" w:eastAsia="ru-RU"/>
@@ -2445,15 +2300,42 @@
     <w:p>
       <w:pPr>
         <w:pStyle w:val="Normal"/>
+        <w:widowControl w:val="false"/>
+        <w:tabs>
+          <w:tab w:val="clear" w:pos="709"/>
+          <w:tab w:val="left" w:pos="2827" w:leader="none"/>
+        </w:tabs>
+        <w:spacing w:before="0" w:after="0"/>
         <w:rPr>
-          <w:rFonts w:ascii="Helvetica Neue" w:hAnsi="Helvetica Neue"/>
+          <w:rFonts w:ascii="Open Sans" w:hAnsi="Open Sans"/>
+          <w:b w:val="false"/>
+          <w:bCs w:val="false"/>
           <w:sz w:val="18"/>
           <w:szCs w:val="18"/>
+          <w:lang w:val="de-DE" w:eastAsia="ru-RU"/>
         </w:rPr>
       </w:pPr>
       <w:r>
         <w:rPr>
-          <w:rFonts w:ascii="Helvetica Neue" w:hAnsi="Helvetica Neue"/>
+          <w:rFonts w:ascii="Open Sans" w:hAnsi="Open Sans"/>
+          <w:b w:val="false"/>
+          <w:bCs w:val="false"/>
+          <w:sz w:val="18"/>
+          <w:szCs w:val="18"/>
+          <w:lang w:val="de-DE" w:eastAsia="ru-RU"/>
+        </w:rPr>
+      </w:r>
+    </w:p>
+    <w:p>
+      <w:pPr>
+        <w:pStyle w:val="Normal"/>
+        <w:rPr>
+          <w:rFonts w:ascii="Open Sans" w:hAnsi="Open Sans"/>
+        </w:rPr>
+      </w:pPr>
+      <w:r>
+        <w:rPr>
+          <w:rFonts w:ascii="Open Sans" w:hAnsi="Open Sans"/>
           <w:sz w:val="18"/>
           <w:szCs w:val="18"/>
         </w:rPr>
@@ -2468,7 +2350,7 @@
       </w:pPr>
       <w:r>
         <w:rPr>
-          <w:rFonts w:eastAsia="Arial" w:cs="Arial" w:ascii="Helvetica Neue" w:hAnsi="Helvetica Neue"/>
+          <w:rFonts w:eastAsia="Arial" w:cs="Arial" w:ascii="Open Sans" w:hAnsi="Open Sans"/>
           <w:sz w:val="18"/>
           <w:szCs w:val="18"/>
           <w:lang w:val="de-DE" w:eastAsia="ru-RU"/>
@@ -2479,7 +2361,7 @@
         <w:r>
           <w:rPr>
             <w:rStyle w:val="Hyperlink"/>
-            <w:rFonts w:eastAsia="Arial" w:cs="Arial" w:ascii="Helvetica Neue" w:hAnsi="Helvetica Neue"/>
+            <w:rFonts w:eastAsia="Arial" w:cs="Arial" w:ascii="Open Sans" w:hAnsi="Open Sans"/>
             <w:color w:val="auto"/>
             <w:sz w:val="18"/>
             <w:szCs w:val="18"/>
@@ -2490,7 +2372,7 @@
       </w:hyperlink>
       <w:r>
         <w:rPr>
-          <w:rFonts w:eastAsia="Arial" w:cs="Arial" w:ascii="Helvetica Neue" w:hAnsi="Helvetica Neue"/>
+          <w:rFonts w:eastAsia="Arial" w:cs="Arial" w:ascii="Open Sans" w:hAnsi="Open Sans"/>
           <w:sz w:val="18"/>
           <w:szCs w:val="18"/>
           <w:lang w:val="de-DE" w:eastAsia="ru-RU"/>
@@ -2503,7 +2385,7 @@
         <w:pStyle w:val="Normal"/>
         <w:spacing w:lineRule="auto" w:line="276"/>
         <w:rPr>
-          <w:rFonts w:ascii="Helvetica Neue" w:hAnsi="Helvetica Neue"/>
+          <w:rFonts w:ascii="Open Sans" w:hAnsi="Open Sans"/>
           <w:sz w:val="18"/>
           <w:szCs w:val="18"/>
           <w:lang w:val="de-DE" w:eastAsia="ru-RU"/>
@@ -2511,7 +2393,7 @@
       </w:pPr>
       <w:r>
         <w:rPr>
-          <w:rFonts w:ascii="Helvetica Neue" w:hAnsi="Helvetica Neue"/>
+          <w:rFonts w:ascii="Open Sans" w:hAnsi="Open Sans"/>
           <w:sz w:val="18"/>
           <w:szCs w:val="18"/>
           <w:lang w:val="de-DE" w:eastAsia="ru-RU"/>
@@ -2523,14 +2405,12 @@
         <w:pStyle w:val="Normal"/>
         <w:spacing w:lineRule="auto" w:line="276"/>
         <w:rPr>
-          <w:rFonts w:ascii="Helvetica Neue" w:hAnsi="Helvetica Neue"/>
-          <w:sz w:val="18"/>
-          <w:szCs w:val="18"/>
+          <w:rFonts w:ascii="Open Sans" w:hAnsi="Open Sans"/>
         </w:rPr>
       </w:pPr>
       <w:r>
         <w:rPr>
-          <w:rFonts w:eastAsia="Arial" w:cs="Arial" w:ascii="Helvetica Neue" w:hAnsi="Helvetica Neue"/>
+          <w:rFonts w:eastAsia="Arial" w:cs="Arial" w:ascii="Open Sans" w:hAnsi="Open Sans"/>
           <w:sz w:val="18"/>
           <w:szCs w:val="18"/>
           <w:lang w:val="de-DE" w:eastAsia="ru-RU"/>
@@ -2543,15 +2423,12 @@
         <w:pStyle w:val="Normal"/>
         <w:spacing w:lineRule="auto" w:line="276"/>
         <w:rPr>
-          <w:rFonts w:ascii="Helvetica Neue" w:hAnsi="Helvetica Neue" w:eastAsia="Arial" w:cs="Arial"/>
-          <w:sz w:val="18"/>
-          <w:szCs w:val="18"/>
-          <w:lang w:val="de-DE" w:eastAsia="ru-RU"/>
+          <w:rFonts w:ascii="Open Sans" w:hAnsi="Open Sans"/>
         </w:rPr>
       </w:pPr>
       <w:r>
         <w:rPr>
-          <w:rFonts w:eastAsia="Arial" w:cs="Arial" w:ascii="Helvetica Neue" w:hAnsi="Helvetica Neue"/>
+          <w:rFonts w:eastAsia="Arial" w:cs="Arial" w:ascii="Open Sans" w:hAnsi="Open Sans"/>
           <w:sz w:val="18"/>
           <w:szCs w:val="18"/>
           <w:lang w:val="de-DE" w:eastAsia="ru-RU"/>
@@ -2564,7 +2441,7 @@
         <w:pStyle w:val="Normal"/>
         <w:spacing w:lineRule="auto" w:line="276"/>
         <w:rPr>
-          <w:rFonts w:ascii="Helvetica Neue" w:hAnsi="Helvetica Neue" w:eastAsia="Arial" w:cs="Arial"/>
+          <w:rFonts w:ascii="Open Sans" w:hAnsi="Open Sans" w:eastAsia="Arial" w:cs="Arial"/>
           <w:sz w:val="18"/>
           <w:szCs w:val="18"/>
           <w:lang w:val="de-DE" w:eastAsia="ru-RU"/>
@@ -2572,7 +2449,7 @@
       </w:pPr>
       <w:r>
         <w:rPr>
-          <w:rFonts w:eastAsia="Arial" w:cs="Arial" w:ascii="Helvetica Neue" w:hAnsi="Helvetica Neue"/>
+          <w:rFonts w:eastAsia="Arial" w:cs="Arial" w:ascii="Open Sans" w:hAnsi="Open Sans"/>
           <w:sz w:val="18"/>
           <w:szCs w:val="18"/>
           <w:lang w:val="de-DE" w:eastAsia="ru-RU"/>
@@ -2624,14 +2501,12 @@
               <w:ind w:hanging="0" w:left="0" w:right="5309"/>
               <w:jc w:val="left"/>
               <w:rPr>
-                <w:rFonts w:ascii="Helvetica Neue" w:hAnsi="Helvetica Neue"/>
-                <w:sz w:val="16"/>
-                <w:szCs w:val="16"/>
+                <w:rFonts w:ascii="Open Sans" w:hAnsi="Open Sans"/>
               </w:rPr>
             </w:pPr>
             <w:r>
               <w:rPr>
-                <w:rFonts w:eastAsia="Open Sans" w:cs="Open Sans" w:ascii="Helvetica Neue" w:hAnsi="Helvetica Neue"/>
+                <w:rFonts w:eastAsia="Open Sans" w:cs="Open Sans" w:ascii="Open Sans" w:hAnsi="Open Sans"/>
                 <w:color w:val="666666"/>
                 <w:kern w:val="0"/>
                 <w:sz w:val="16"/>
@@ -2649,14 +2524,12 @@
         <w:pStyle w:val="Normal"/>
         <w:spacing w:lineRule="auto" w:line="276" w:before="240" w:after="0"/>
         <w:rPr>
-          <w:rFonts w:ascii="Helvetica Neue" w:hAnsi="Helvetica Neue"/>
-          <w:sz w:val="18"/>
-          <w:szCs w:val="18"/>
+          <w:rFonts w:ascii="Open Sans" w:hAnsi="Open Sans"/>
         </w:rPr>
       </w:pPr>
       <w:r>
         <w:rPr>
-          <w:rFonts w:eastAsia="Arial" w:cs="Arial" w:ascii="Helvetica Neue" w:hAnsi="Helvetica Neue"/>
+          <w:rFonts w:eastAsia="Arial" w:cs="Arial" w:ascii="Open Sans" w:hAnsi="Open Sans"/>
           <w:sz w:val="18"/>
           <w:szCs w:val="18"/>
           <w:lang w:val="de-DE" w:eastAsia="ru-RU"/>
@@ -2669,15 +2542,12 @@
         <w:pStyle w:val="Normal"/>
         <w:spacing w:lineRule="auto" w:line="276" w:before="72" w:after="0"/>
         <w:rPr>
-          <w:rFonts w:ascii="Helvetica Neue" w:hAnsi="Helvetica Neue" w:eastAsia="Arial" w:cs="Arial"/>
-          <w:sz w:val="18"/>
-          <w:szCs w:val="18"/>
-          <w:lang w:val="de-DE" w:eastAsia="ru-RU"/>
+          <w:rFonts w:ascii="Open Sans" w:hAnsi="Open Sans"/>
         </w:rPr>
       </w:pPr>
       <w:r>
         <w:rPr>
-          <w:rFonts w:eastAsia="Arial" w:cs="Arial" w:ascii="Helvetica Neue" w:hAnsi="Helvetica Neue"/>
+          <w:rFonts w:eastAsia="Arial" w:cs="Arial" w:ascii="Open Sans" w:hAnsi="Open Sans"/>
           <w:sz w:val="18"/>
           <w:szCs w:val="18"/>
           <w:lang w:val="de-DE" w:eastAsia="ru-RU"/>
@@ -2693,14 +2563,12 @@
         <w:ind w:hanging="0" w:left="0" w:right="0"/>
         <w:jc w:val="both"/>
         <w:rPr>
-          <w:rFonts w:ascii="Helvetica Neue" w:hAnsi="Helvetica Neue"/>
-          <w:sz w:val="18"/>
-          <w:szCs w:val="18"/>
+          <w:rFonts w:ascii="Open Sans" w:hAnsi="Open Sans"/>
         </w:rPr>
       </w:pPr>
       <w:r>
         <w:rPr>
-          <w:rFonts w:ascii="Helvetica Neue" w:hAnsi="Helvetica Neue"/>
+          <w:rFonts w:ascii="Open Sans" w:hAnsi="Open Sans"/>
           <w:b w:val="false"/>
           <w:i w:val="false"/>
           <w:caps w:val="false"/>
@@ -2718,14 +2586,12 @@
         <w:pStyle w:val="Normal"/>
         <w:spacing w:before="0" w:after="120"/>
         <w:rPr>
-          <w:rFonts w:ascii="Helvetica Neue" w:hAnsi="Helvetica Neue"/>
-          <w:sz w:val="18"/>
-          <w:szCs w:val="18"/>
+          <w:rFonts w:ascii="Open Sans" w:hAnsi="Open Sans"/>
         </w:rPr>
       </w:pPr>
       <w:r>
         <w:rPr>
-          <w:rFonts w:eastAsia="Open Sans" w:cs="Open Sans" w:ascii="Helvetica Neue" w:hAnsi="Helvetica Neue"/>
+          <w:rFonts w:eastAsia="Open Sans" w:cs="Open Sans" w:ascii="Open Sans" w:hAnsi="Open Sans"/>
           <w:b w:val="false"/>
           <w:i w:val="false"/>
           <w:caps w:val="false"/>
@@ -2749,14 +2615,12 @@
         <w:ind w:hanging="0" w:left="0"/>
         <w:outlineLvl w:val="0"/>
         <w:rPr>
-          <w:rFonts w:ascii="Helvetica Neue" w:hAnsi="Helvetica Neue"/>
-          <w:sz w:val="18"/>
-          <w:szCs w:val="18"/>
+          <w:rFonts w:ascii="Open Sans" w:hAnsi="Open Sans"/>
         </w:rPr>
       </w:pPr>
       <w:r>
         <w:rPr>
-          <w:rFonts w:eastAsia="Arial" w:cs="Arial" w:ascii="Helvetica Neue" w:hAnsi="Helvetica Neue"/>
+          <w:rFonts w:eastAsia="Arial" w:cs="Arial" w:ascii="Open Sans" w:hAnsi="Open Sans"/>
           <w:sz w:val="18"/>
           <w:szCs w:val="18"/>
           <w:lang w:val="de-DE" w:eastAsia="ru-RU"/>
@@ -2775,14 +2639,12 @@
         <w:ind w:hanging="0" w:left="0"/>
         <w:outlineLvl w:val="0"/>
         <w:rPr>
-          <w:rFonts w:ascii="Helvetica Neue" w:hAnsi="Helvetica Neue"/>
-          <w:sz w:val="18"/>
-          <w:szCs w:val="18"/>
+          <w:rFonts w:ascii="Open Sans" w:hAnsi="Open Sans"/>
         </w:rPr>
       </w:pPr>
       <w:r>
         <w:rPr>
-          <w:rFonts w:eastAsia="Arial" w:cs="Arial" w:ascii="Helvetica Neue" w:hAnsi="Helvetica Neue"/>
+          <w:rFonts w:eastAsia="Arial" w:cs="Arial" w:ascii="Open Sans" w:hAnsi="Open Sans"/>
           <w:sz w:val="18"/>
           <w:szCs w:val="18"/>
           <w:lang w:val="de-DE" w:eastAsia="ru-RU"/>
@@ -2793,43 +2655,14 @@
     <w:p>
       <w:pPr>
         <w:pStyle w:val="Normal"/>
-        <w:numPr>
-          <w:ilvl w:val="0"/>
-          <w:numId w:val="0"/>
-        </w:numPr>
         <w:spacing w:lineRule="auto" w:line="276"/>
-        <w:ind w:hanging="0" w:left="0"/>
-        <w:outlineLvl w:val="0"/>
         <w:rPr>
-          <w:rFonts w:ascii="Helvetica Neue" w:hAnsi="Helvetica Neue" w:eastAsia="Arial" w:cs="Arial"/>
-          <w:sz w:val="18"/>
-          <w:szCs w:val="18"/>
-          <w:lang w:val="de-DE"/>
+          <w:rFonts w:ascii="Open Sans" w:hAnsi="Open Sans"/>
         </w:rPr>
       </w:pPr>
       <w:r>
         <w:rPr>
-          <w:rFonts w:eastAsia="Arial" w:cs="Arial" w:ascii="Helvetica Neue" w:hAnsi="Helvetica Neue"/>
-          <w:sz w:val="18"/>
-          <w:szCs w:val="18"/>
-          <w:lang w:val="de-DE"/>
-        </w:rPr>
-      </w:r>
-    </w:p>
-    <w:p>
-      <w:pPr>
-        <w:pStyle w:val="Normal"/>
-        <w:spacing w:lineRule="auto" w:line="276"/>
-        <w:rPr>
-          <w:rFonts w:ascii="Helvetica Neue" w:hAnsi="Helvetica Neue" w:cs="Arial"/>
-          <w:sz w:val="18"/>
-          <w:szCs w:val="18"/>
-          <w:lang w:val="de-DE" w:eastAsia="ru-RU"/>
-        </w:rPr>
-      </w:pPr>
-      <w:r>
-        <w:rPr>
-          <w:rFonts w:cs="Arial" w:ascii="Helvetica Neue" w:hAnsi="Helvetica Neue"/>
+          <w:rFonts w:cs="Arial" w:ascii="Open Sans" w:hAnsi="Open Sans"/>
           <w:sz w:val="18"/>
           <w:szCs w:val="18"/>
           <w:lang w:val="de-DE" w:eastAsia="ru-RU"/>
@@ -2842,14 +2675,12 @@
         <w:pStyle w:val="Normal"/>
         <w:spacing w:before="0" w:after="60"/>
         <w:rPr>
-          <w:rFonts w:ascii="Helvetica Neue" w:hAnsi="Helvetica Neue"/>
-          <w:sz w:val="18"/>
-          <w:szCs w:val="18"/>
+          <w:rFonts w:ascii="Open Sans" w:hAnsi="Open Sans"/>
         </w:rPr>
       </w:pPr>
       <w:r>
         <w:rPr>
-          <w:rFonts w:eastAsia="Open Sans" w:cs="Open Sans" w:ascii="Helvetica Neue" w:hAnsi="Helvetica Neue"/>
+          <w:rFonts w:eastAsia="Open Sans" w:cs="Open Sans" w:ascii="Open Sans" w:hAnsi="Open Sans"/>
           <w:color w:val="070707"/>
           <w:sz w:val="18"/>
           <w:szCs w:val="18"/>

</xml_diff>